<commit_message>
feat: finalize quote workflow and submission evidence
</commit_message>
<xml_diff>
--- a/output/business-proposal/Quotation-Desk-Business-Proposal.docx
+++ b/output/business-proposal/Quotation-Desk-Business-Proposal.docx
@@ -5,98 +5,162 @@
     <w:p>
       <w:pPr>
         <w:pStyle w:val="Title"/>
-        <w:pBdr>
-          <w:bottom w:val="nil"/>
-        </w:pBdr>
       </w:pPr>
       <w:r>
         <w:rPr>
-          <w:b w:val="0"/>
-          <w:i w:val="0"/>
+          <w:rFonts w:ascii="Arial" w:hAnsi="Arial" w:eastAsia="Arial"/>
+          <w:color w:val="000000"/>
+          <w:sz w:val="50"/>
         </w:rPr>
         <w:t>Quotation Desk business proposal</w:t>
       </w:r>
     </w:p>
     <w:p>
+      <w:pPr>
+        <w:widowControl/>
+        <w:spacing w:after="240"/>
+      </w:pPr>
       <w:r>
         <w:rPr>
-          <w:b w:val="0"/>
-          <w:i w:val="0"/>
+          <w:rFonts w:ascii="Georgia" w:hAnsi="Georgia" w:eastAsia="Georgia"/>
+          <w:sz w:val="21"/>
         </w:rPr>
         <w:t>Show Me Your Agents Hackathon | September 2026</w:t>
       </w:r>
     </w:p>
     <w:p>
+      <w:pPr>
+        <w:widowControl/>
+      </w:pPr>
       <w:r>
         <w:rPr>
+          <w:rFonts w:ascii="Georgia" w:hAnsi="Georgia" w:eastAsia="Georgia"/>
           <w:b/>
-          <w:i w:val="0"/>
+          <w:sz w:val="21"/>
         </w:rPr>
         <w:t>Project:</w:t>
       </w:r>
       <w:r>
         <w:rPr>
-          <w:b w:val="0"/>
-          <w:i w:val="0"/>
+          <w:rFonts w:ascii="Georgia" w:hAnsi="Georgia" w:eastAsia="Georgia"/>
+          <w:sz w:val="21"/>
         </w:rPr>
-        <w:t xml:space="preserve"> Quotation Desk </w:t>
+        <w:t xml:space="preserve"> Quotation Desk</w:t>
       </w:r>
     </w:p>
     <w:p>
+      <w:pPr>
+        <w:widowControl/>
+      </w:pPr>
       <w:r>
         <w:rPr>
+          <w:rFonts w:ascii="Georgia" w:hAnsi="Georgia" w:eastAsia="Georgia"/>
           <w:b/>
-          <w:i w:val="0"/>
+          <w:sz w:val="21"/>
         </w:rPr>
         <w:t>Team code:</w:t>
       </w:r>
       <w:r>
         <w:rPr>
-          <w:b w:val="0"/>
-          <w:i w:val="0"/>
+          <w:rFonts w:ascii="Georgia" w:hAnsi="Georgia" w:eastAsia="Georgia"/>
+          <w:sz w:val="21"/>
         </w:rPr>
-        <w:t xml:space="preserve"> [Add registered team code] </w:t>
+        <w:t xml:space="preserve"> [Add registered team code]</w:t>
       </w:r>
     </w:p>
     <w:p>
+      <w:pPr>
+        <w:widowControl/>
+      </w:pPr>
       <w:r>
         <w:rPr>
+          <w:rFonts w:ascii="Georgia" w:hAnsi="Georgia" w:eastAsia="Georgia"/>
           <w:b/>
-          <w:i w:val="0"/>
+          <w:sz w:val="21"/>
         </w:rPr>
         <w:t>Repository:</w:t>
       </w:r>
       <w:r>
         <w:rPr>
-          <w:b w:val="0"/>
-          <w:i w:val="0"/>
+          <w:rFonts w:ascii="Georgia" w:hAnsi="Georgia" w:eastAsia="Georgia"/>
+          <w:sz w:val="21"/>
         </w:rPr>
-        <w:t xml:space="preserve"> https://github.com/HELLSJ/ISS-Hackson-Quotation-Preparation </w:t>
+        <w:t xml:space="preserve"> </w:t>
       </w:r>
+      <w:hyperlink r:id="rId15">
+        <w:r>
+          <w:rPr>
+            <w:color w:val="1F5F99"/>
+            <w:u w:val="single"/>
+          </w:rPr>
+          <w:t>Quotation Desk source repository</w:t>
+        </w:r>
+      </w:hyperlink>
     </w:p>
     <w:p>
+      <w:pPr>
+        <w:widowControl/>
+      </w:pPr>
       <w:r>
         <w:rPr>
+          <w:rFonts w:ascii="Georgia" w:hAnsi="Georgia" w:eastAsia="Georgia"/>
           <w:b/>
-          <w:i w:val="0"/>
+          <w:sz w:val="21"/>
         </w:rPr>
         <w:t>Live workbench:</w:t>
       </w:r>
       <w:r>
         <w:rPr>
-          <w:b w:val="0"/>
-          <w:i w:val="0"/>
+          <w:rFonts w:ascii="Georgia" w:hAnsi="Georgia" w:eastAsia="Georgia"/>
+          <w:sz w:val="21"/>
         </w:rPr>
-        <w:t xml:space="preserve"> http://47.131.151.253/</w:t>
+        <w:t xml:space="preserve"> </w:t>
+      </w:r>
+      <w:hyperlink r:id="rId16">
+        <w:r>
+          <w:rPr>
+            <w:color w:val="1F5F99"/>
+            <w:u w:val="single"/>
+          </w:rPr>
+          <w:t>Quotation Desk live demo</w:t>
+        </w:r>
+      </w:hyperlink>
+    </w:p>
+    <w:p>
+      <w:pPr>
+        <w:pStyle w:val="Heading1"/>
+      </w:pPr>
+      <w:r>
+        <w:rPr>
+          <w:rFonts w:ascii="Arial" w:hAnsi="Arial" w:eastAsia="Arial"/>
+          <w:color w:val="000000"/>
+          <w:sz w:val="30"/>
+        </w:rPr>
+        <w:t>Pilot request</w:t>
       </w:r>
     </w:p>
     <w:p>
+      <w:pPr>
+        <w:widowControl/>
+      </w:pPr>
       <w:r>
         <w:rPr>
-          <w:b w:val="0"/>
-          <w:i w:val="0"/>
+          <w:rFonts w:ascii="Georgia" w:hAnsi="Georgia" w:eastAsia="Georgia"/>
+          <w:sz w:val="21"/>
         </w:rPr>
-        <w:t>We seek a two-week pilot of Quotation Desk with one quotation employee and one reviewer. The workbench turns an incomplete monitor enquiry into a draft with manufacturer evidence, a calculated price, and a record of every saved version. Its current catalogue covers 50 Dell and Lenovo/ThinkVision models. The pilot would test whether staff can prepare correct quotes with less effort before the business considers customer-facing use.</w:t>
+        <w:t>We propose a two-week pilot with one quotation employee and one reviewer. Quotation Desk turns an incomplete monitor enquiry into a reviewable draft with manufacturer evidence, deterministic pricing, and an audit trail of saved drafts. The final catalogue contains 50 Dell and Lenovo/ThinkVision models.</w:t>
+      </w:r>
+    </w:p>
+    <w:p>
+      <w:pPr>
+        <w:widowControl/>
+      </w:pPr>
+      <w:r>
+        <w:rPr>
+          <w:rFonts w:ascii="Georgia" w:hAnsi="Georgia" w:eastAsia="Georgia"/>
+          <w:sz w:val="21"/>
+        </w:rPr>
+        <w:t>The pilot has one purpose: determine whether staff can prepare correct quotations with less time and rework than the current manual process. It would use de-identified enquiries and synthetic prices. Customer-facing use would be considered only after the business measures the workflow and adds the controls listed later in this proposal.</w:t>
       </w:r>
     </w:p>
     <w:p>
@@ -105,37 +169,59 @@
       </w:pPr>
       <w:r>
         <w:rPr>
-          <w:b w:val="0"/>
-          <w:i w:val="0"/>
+          <w:rFonts w:ascii="Arial" w:hAnsi="Arial" w:eastAsia="Arial"/>
+          <w:color w:val="000000"/>
+          <w:sz w:val="30"/>
         </w:rPr>
         <w:t>The business problem</w:t>
       </w:r>
     </w:p>
     <w:p>
+      <w:pPr>
+        <w:widowControl/>
+      </w:pPr>
       <w:r>
         <w:rPr>
-          <w:b w:val="0"/>
-          <w:i w:val="0"/>
+          <w:rFonts w:ascii="Georgia" w:hAnsi="Georgia" w:eastAsia="Georgia"/>
+          <w:sz w:val="21"/>
         </w:rPr>
-        <w:t>A customer may ask for "eight USB-C monitors under SGD 2,500." The quotation employee still has to find out whether USB-C means video input, laptop charging, or merely a data port. They then compare models, check source documents, calculate the total, record any discount, seek approval, and prepare a document the customer can receive. A change from eight units to ten can require the same checks again.</w:t>
+        <w:t>A customer may ask for "eight USB-C monitors under SGD 2,500." That is not enough information to select a product. USB-C may mean video input, laptop charging, or a data-only port. The quotation employee must clarify the request, compare models, check source documents, calculate the total, record any discount, seek approval, and prepare a document for the customer. A change from eight units to ten can require the same checks again.</w:t>
       </w:r>
     </w:p>
     <w:p>
+      <w:pPr>
+        <w:widowControl/>
+      </w:pPr>
       <w:r>
         <w:rPr>
-          <w:b w:val="0"/>
-          <w:i w:val="0"/>
+          <w:rFonts w:ascii="Georgia" w:hAnsi="Georgia" w:eastAsia="Georgia"/>
+          <w:sz w:val="21"/>
         </w:rPr>
-        <w:t>For a small sales team, each handoff between enquiry, specification PDF, price sheet, and approval message adds work. A USB-C recommendation can be wrong even when the model name looks right. A calculation mistake or overwritten draft can make an earlier price hard to explain. These are workflow risks, not losses measured at a participating SME. The pilot will record errors and rework rather than assume how often they occur.</w:t>
+        <w:t>Small sales teams often carry this work across email, specification PDFs, price sheets, calculators, and approval messages. A model name can look correct while its port direction or charging capacity is wrong. A calculation error or overwritten draft can also make an earlier price difficult to explain.</w:t>
       </w:r>
     </w:p>
     <w:p>
+      <w:pPr>
+        <w:widowControl/>
+      </w:pPr>
       <w:r>
         <w:rPr>
-          <w:b w:val="0"/>
-          <w:i w:val="0"/>
+          <w:rFonts w:ascii="Georgia" w:hAnsi="Georgia" w:eastAsia="Georgia"/>
+          <w:sz w:val="21"/>
         </w:rPr>
-        <w:t>Quotation Desk is aimed at quotation staff and sales coordinators who prepare the draft, and a reviewer who confirms it. The initial scope is monitor enquiries within a maintained product catalogue. Stock, delivery dates, tax, customer-specific contracts, and manufacturer prices are outside the prototype's data. Staff must handle those matters through their normal process before making a commercial commitment.</w:t>
+        <w:t>These are plausible workflow risks, not measured losses at a participating SME. The proposed pilot will record preparation time, corrections, and rework instead of assuming how often those problems occur.</w:t>
+      </w:r>
+    </w:p>
+    <w:p>
+      <w:pPr>
+        <w:widowControl/>
+      </w:pPr>
+      <w:r>
+        <w:rPr>
+          <w:rFonts w:ascii="Georgia" w:hAnsi="Georgia" w:eastAsia="Georgia"/>
+          <w:sz w:val="21"/>
+        </w:rPr>
+        <w:t>The initial scope is deliberately narrow: monitor enquiries within a maintained catalogue. Stock, delivery dates, tax, customer-specific contracts, and manufacturer prices are outside the prototype's data. Staff must handle those matters through the normal commercial process before making a commitment.</w:t>
       </w:r>
     </w:p>
     <w:p>
@@ -144,50 +230,481 @@
       </w:pPr>
       <w:r>
         <w:rPr>
-          <w:b w:val="0"/>
-          <w:i w:val="0"/>
+          <w:rFonts w:ascii="Arial" w:hAnsi="Arial" w:eastAsia="Arial"/>
+          <w:color w:val="000000"/>
+          <w:sz w:val="30"/>
         </w:rPr>
-        <w:t>How the quotation changes</w:t>
+        <w:t>How the workflow changes</w:t>
+      </w:r>
+    </w:p>
+    <w:tbl>
+      <w:tblPr>
+        <w:tblW w:type="auto" w:w="0"/>
+        <w:jc w:val="center"/>
+        <w:tblLayout w:type="fixed"/>
+        <w:tblLook w:firstColumn="1" w:firstRow="1" w:lastColumn="0" w:lastRow="0" w:noHBand="0" w:noVBand="1" w:val="04A0"/>
+      </w:tblPr>
+      <w:tblGrid>
+        <w:gridCol w:w="5083"/>
+        <w:gridCol w:w="5083"/>
+      </w:tblGrid>
+      <w:tr>
+        <w:trPr>
+          <w:tblHeader/>
+        </w:trPr>
+        <w:tc>
+          <w:tcPr>
+            <w:tcW w:type="dxa" w:w="4824"/>
+            <w:vAlign w:val="center"/>
+            <w:tcMar>
+              <w:top w:w="90" w:type="dxa"/>
+              <w:start w:w="110" w:type="dxa"/>
+              <w:bottom w:w="90" w:type="dxa"/>
+              <w:end w:w="110" w:type="dxa"/>
+            </w:tcMar>
+            <w:tcBorders>
+              <w:top w:val="single" w:sz="4" w:color="D9D9D9"/>
+              <w:left w:val="single" w:sz="4" w:color="D9D9D9"/>
+              <w:bottom w:val="single" w:sz="4" w:color="D9D9D9"/>
+              <w:right w:val="single" w:sz="4" w:color="D9D9D9"/>
+              <w:insideH w:val="single" w:sz="4" w:color="D9D9D9"/>
+              <w:insideV w:val="single" w:sz="4" w:color="D9D9D9"/>
+            </w:tcBorders>
+            <w:shd w:fill="102A43"/>
+          </w:tcPr>
+          <w:p>
+            <w:pPr>
+              <w:spacing w:after="0" w:line="252" w:lineRule="auto"/>
+            </w:pPr>
+            <w:r>
+              <w:rPr>
+                <w:rFonts w:ascii="Arial" w:hAnsi="Arial" w:eastAsia="Arial"/>
+                <w:b/>
+                <w:color w:val="FFFFFF"/>
+                <w:sz w:val="18"/>
+              </w:rPr>
+              <w:t>Current manual process</w:t>
+            </w:r>
+          </w:p>
+        </w:tc>
+        <w:tc>
+          <w:tcPr>
+            <w:tcW w:type="dxa" w:w="4824"/>
+            <w:vAlign w:val="center"/>
+            <w:tcMar>
+              <w:top w:w="90" w:type="dxa"/>
+              <w:start w:w="110" w:type="dxa"/>
+              <w:bottom w:w="90" w:type="dxa"/>
+              <w:end w:w="110" w:type="dxa"/>
+            </w:tcMar>
+            <w:tcBorders>
+              <w:top w:val="single" w:sz="4" w:color="D9D9D9"/>
+              <w:left w:val="single" w:sz="4" w:color="D9D9D9"/>
+              <w:bottom w:val="single" w:sz="4" w:color="D9D9D9"/>
+              <w:right w:val="single" w:sz="4" w:color="D9D9D9"/>
+              <w:insideH w:val="single" w:sz="4" w:color="D9D9D9"/>
+              <w:insideV w:val="single" w:sz="4" w:color="D9D9D9"/>
+            </w:tcBorders>
+            <w:shd w:fill="102A43"/>
+          </w:tcPr>
+          <w:p>
+            <w:pPr>
+              <w:spacing w:after="0" w:line="252" w:lineRule="auto"/>
+            </w:pPr>
+            <w:r>
+              <w:rPr>
+                <w:rFonts w:ascii="Arial" w:hAnsi="Arial" w:eastAsia="Arial"/>
+                <w:b/>
+                <w:color w:val="FFFFFF"/>
+                <w:sz w:val="18"/>
+              </w:rPr>
+              <w:t>Quotation Desk process</w:t>
+            </w:r>
+          </w:p>
+        </w:tc>
+      </w:tr>
+      <w:tr>
+        <w:tc>
+          <w:tcPr>
+            <w:tcW w:type="dxa" w:w="4824"/>
+            <w:vAlign w:val="center"/>
+            <w:tcMar>
+              <w:top w:w="90" w:type="dxa"/>
+              <w:start w:w="110" w:type="dxa"/>
+              <w:bottom w:w="90" w:type="dxa"/>
+              <w:end w:w="110" w:type="dxa"/>
+            </w:tcMar>
+            <w:tcBorders>
+              <w:top w:val="single" w:sz="4" w:color="D9D9D9"/>
+              <w:left w:val="single" w:sz="4" w:color="D9D9D9"/>
+              <w:bottom w:val="single" w:sz="4" w:color="D9D9D9"/>
+              <w:right w:val="single" w:sz="4" w:color="D9D9D9"/>
+              <w:insideH w:val="single" w:sz="4" w:color="D9D9D9"/>
+              <w:insideV w:val="single" w:sz="4" w:color="D9D9D9"/>
+            </w:tcBorders>
+            <w:shd w:fill="FFFFFF"/>
+          </w:tcPr>
+          <w:p>
+            <w:pPr>
+              <w:spacing w:after="0" w:line="252" w:lineRule="auto"/>
+            </w:pPr>
+            <w:r>
+              <w:rPr>
+                <w:rFonts w:ascii="Georgia" w:hAnsi="Georgia" w:eastAsia="Georgia"/>
+                <w:sz w:val="18"/>
+              </w:rPr>
+              <w:t>Read the enquiry and identify missing details</w:t>
+            </w:r>
+          </w:p>
+        </w:tc>
+        <w:tc>
+          <w:tcPr>
+            <w:tcW w:type="dxa" w:w="4824"/>
+            <w:vAlign w:val="center"/>
+            <w:tcMar>
+              <w:top w:w="90" w:type="dxa"/>
+              <w:start w:w="110" w:type="dxa"/>
+              <w:bottom w:w="90" w:type="dxa"/>
+              <w:end w:w="110" w:type="dxa"/>
+            </w:tcMar>
+            <w:tcBorders>
+              <w:top w:val="single" w:sz="4" w:color="D9D9D9"/>
+              <w:left w:val="single" w:sz="4" w:color="D9D9D9"/>
+              <w:bottom w:val="single" w:sz="4" w:color="D9D9D9"/>
+              <w:right w:val="single" w:sz="4" w:color="D9D9D9"/>
+              <w:insideH w:val="single" w:sz="4" w:color="D9D9D9"/>
+              <w:insideV w:val="single" w:sz="4" w:color="D9D9D9"/>
+            </w:tcBorders>
+            <w:shd w:fill="FFFFFF"/>
+          </w:tcPr>
+          <w:p>
+            <w:pPr>
+              <w:spacing w:after="0" w:line="252" w:lineRule="auto"/>
+            </w:pPr>
+            <w:r>
+              <w:rPr>
+                <w:rFonts w:ascii="Georgia" w:hAnsi="Georgia" w:eastAsia="Georgia"/>
+                <w:sz w:val="18"/>
+              </w:rPr>
+              <w:t>The Agent identifies missing requirements and asks focused questions</w:t>
+            </w:r>
+          </w:p>
+        </w:tc>
+      </w:tr>
+      <w:tr>
+        <w:tc>
+          <w:tcPr>
+            <w:tcW w:type="dxa" w:w="4824"/>
+            <w:vAlign w:val="center"/>
+            <w:tcMar>
+              <w:top w:w="90" w:type="dxa"/>
+              <w:start w:w="110" w:type="dxa"/>
+              <w:bottom w:w="90" w:type="dxa"/>
+              <w:end w:w="110" w:type="dxa"/>
+            </w:tcMar>
+            <w:tcBorders>
+              <w:top w:val="single" w:sz="4" w:color="D9D9D9"/>
+              <w:left w:val="single" w:sz="4" w:color="D9D9D9"/>
+              <w:bottom w:val="single" w:sz="4" w:color="D9D9D9"/>
+              <w:right w:val="single" w:sz="4" w:color="D9D9D9"/>
+              <w:insideH w:val="single" w:sz="4" w:color="D9D9D9"/>
+              <w:insideV w:val="single" w:sz="4" w:color="D9D9D9"/>
+            </w:tcBorders>
+            <w:shd w:fill="F2F6FA"/>
+          </w:tcPr>
+          <w:p>
+            <w:pPr>
+              <w:spacing w:after="0" w:line="252" w:lineRule="auto"/>
+            </w:pPr>
+            <w:r>
+              <w:rPr>
+                <w:rFonts w:ascii="Georgia" w:hAnsi="Georgia" w:eastAsia="Georgia"/>
+                <w:sz w:val="18"/>
+              </w:rPr>
+              <w:t>Search specifications and compare models</w:t>
+            </w:r>
+          </w:p>
+        </w:tc>
+        <w:tc>
+          <w:tcPr>
+            <w:tcW w:type="dxa" w:w="4824"/>
+            <w:vAlign w:val="center"/>
+            <w:tcMar>
+              <w:top w:w="90" w:type="dxa"/>
+              <w:start w:w="110" w:type="dxa"/>
+              <w:bottom w:w="90" w:type="dxa"/>
+              <w:end w:w="110" w:type="dxa"/>
+            </w:tcMar>
+            <w:tcBorders>
+              <w:top w:val="single" w:sz="4" w:color="D9D9D9"/>
+              <w:left w:val="single" w:sz="4" w:color="D9D9D9"/>
+              <w:bottom w:val="single" w:sz="4" w:color="D9D9D9"/>
+              <w:right w:val="single" w:sz="4" w:color="D9D9D9"/>
+              <w:insideH w:val="single" w:sz="4" w:color="D9D9D9"/>
+              <w:insideV w:val="single" w:sz="4" w:color="D9D9D9"/>
+            </w:tcBorders>
+            <w:shd w:fill="F2F6FA"/>
+          </w:tcPr>
+          <w:p>
+            <w:pPr>
+              <w:spacing w:after="0" w:line="252" w:lineRule="auto"/>
+            </w:pPr>
+            <w:r>
+              <w:rPr>
+                <w:rFonts w:ascii="Georgia" w:hAnsi="Georgia" w:eastAsia="Georgia"/>
+                <w:sz w:val="18"/>
+              </w:rPr>
+              <w:t>The catalogue returns matching products with manufacturer source pages</w:t>
+            </w:r>
+          </w:p>
+        </w:tc>
+      </w:tr>
+      <w:tr>
+        <w:tc>
+          <w:tcPr>
+            <w:tcW w:type="dxa" w:w="4824"/>
+            <w:vAlign w:val="center"/>
+            <w:tcMar>
+              <w:top w:w="90" w:type="dxa"/>
+              <w:start w:w="110" w:type="dxa"/>
+              <w:bottom w:w="90" w:type="dxa"/>
+              <w:end w:w="110" w:type="dxa"/>
+            </w:tcMar>
+            <w:tcBorders>
+              <w:top w:val="single" w:sz="4" w:color="D9D9D9"/>
+              <w:left w:val="single" w:sz="4" w:color="D9D9D9"/>
+              <w:bottom w:val="single" w:sz="4" w:color="D9D9D9"/>
+              <w:right w:val="single" w:sz="4" w:color="D9D9D9"/>
+              <w:insideH w:val="single" w:sz="4" w:color="D9D9D9"/>
+              <w:insideV w:val="single" w:sz="4" w:color="D9D9D9"/>
+            </w:tcBorders>
+            <w:shd w:fill="FFFFFF"/>
+          </w:tcPr>
+          <w:p>
+            <w:pPr>
+              <w:spacing w:after="0" w:line="252" w:lineRule="auto"/>
+            </w:pPr>
+            <w:r>
+              <w:rPr>
+                <w:rFonts w:ascii="Georgia" w:hAnsi="Georgia" w:eastAsia="Georgia"/>
+                <w:sz w:val="18"/>
+              </w:rPr>
+              <w:t>Calculate prices and check discounts manually</w:t>
+            </w:r>
+          </w:p>
+        </w:tc>
+        <w:tc>
+          <w:tcPr>
+            <w:tcW w:type="dxa" w:w="4824"/>
+            <w:vAlign w:val="center"/>
+            <w:tcMar>
+              <w:top w:w="90" w:type="dxa"/>
+              <w:start w:w="110" w:type="dxa"/>
+              <w:bottom w:w="90" w:type="dxa"/>
+              <w:end w:w="110" w:type="dxa"/>
+            </w:tcMar>
+            <w:tcBorders>
+              <w:top w:val="single" w:sz="4" w:color="D9D9D9"/>
+              <w:left w:val="single" w:sz="4" w:color="D9D9D9"/>
+              <w:bottom w:val="single" w:sz="4" w:color="D9D9D9"/>
+              <w:right w:val="single" w:sz="4" w:color="D9D9D9"/>
+              <w:insideH w:val="single" w:sz="4" w:color="D9D9D9"/>
+              <w:insideV w:val="single" w:sz="4" w:color="D9D9D9"/>
+            </w:tcBorders>
+            <w:shd w:fill="FFFFFF"/>
+          </w:tcPr>
+          <w:p>
+            <w:pPr>
+              <w:spacing w:after="0" w:line="252" w:lineRule="auto"/>
+            </w:pPr>
+            <w:r>
+              <w:rPr>
+                <w:rFonts w:ascii="Georgia" w:hAnsi="Georgia" w:eastAsia="Georgia"/>
+                <w:sz w:val="18"/>
+              </w:rPr>
+              <w:t>A deterministic tool calculates in integer cents and enforces the 5% demo limit</w:t>
+            </w:r>
+          </w:p>
+        </w:tc>
+      </w:tr>
+      <w:tr>
+        <w:tc>
+          <w:tcPr>
+            <w:tcW w:type="dxa" w:w="4824"/>
+            <w:vAlign w:val="center"/>
+            <w:tcMar>
+              <w:top w:w="90" w:type="dxa"/>
+              <w:start w:w="110" w:type="dxa"/>
+              <w:bottom w:w="90" w:type="dxa"/>
+              <w:end w:w="110" w:type="dxa"/>
+            </w:tcMar>
+            <w:tcBorders>
+              <w:top w:val="single" w:sz="4" w:color="D9D9D9"/>
+              <w:left w:val="single" w:sz="4" w:color="D9D9D9"/>
+              <w:bottom w:val="single" w:sz="4" w:color="D9D9D9"/>
+              <w:right w:val="single" w:sz="4" w:color="D9D9D9"/>
+              <w:insideH w:val="single" w:sz="4" w:color="D9D9D9"/>
+              <w:insideV w:val="single" w:sz="4" w:color="D9D9D9"/>
+            </w:tcBorders>
+            <w:shd w:fill="F2F6FA"/>
+          </w:tcPr>
+          <w:p>
+            <w:pPr>
+              <w:spacing w:after="0" w:line="252" w:lineRule="auto"/>
+            </w:pPr>
+            <w:r>
+              <w:rPr>
+                <w:rFonts w:ascii="Georgia" w:hAnsi="Georgia" w:eastAsia="Georgia"/>
+                <w:sz w:val="18"/>
+              </w:rPr>
+              <w:t>Pass drafts through email or separate files</w:t>
+            </w:r>
+          </w:p>
+        </w:tc>
+        <w:tc>
+          <w:tcPr>
+            <w:tcW w:type="dxa" w:w="4824"/>
+            <w:vAlign w:val="center"/>
+            <w:tcMar>
+              <w:top w:w="90" w:type="dxa"/>
+              <w:start w:w="110" w:type="dxa"/>
+              <w:bottom w:w="90" w:type="dxa"/>
+              <w:end w:w="110" w:type="dxa"/>
+            </w:tcMar>
+            <w:tcBorders>
+              <w:top w:val="single" w:sz="4" w:color="D9D9D9"/>
+              <w:left w:val="single" w:sz="4" w:color="D9D9D9"/>
+              <w:bottom w:val="single" w:sz="4" w:color="D9D9D9"/>
+              <w:right w:val="single" w:sz="4" w:color="D9D9D9"/>
+              <w:insideH w:val="single" w:sz="4" w:color="D9D9D9"/>
+              <w:insideV w:val="single" w:sz="4" w:color="D9D9D9"/>
+            </w:tcBorders>
+            <w:shd w:fill="F2F6FA"/>
+          </w:tcPr>
+          <w:p>
+            <w:pPr>
+              <w:spacing w:after="0" w:line="252" w:lineRule="auto"/>
+            </w:pPr>
+            <w:r>
+              <w:rPr>
+                <w:rFonts w:ascii="Georgia" w:hAnsi="Georgia" w:eastAsia="Georgia"/>
+                <w:sz w:val="18"/>
+              </w:rPr>
+              <w:t>Each saved draft remains unchanged and can be compared with the next</w:t>
+            </w:r>
+          </w:p>
+        </w:tc>
+      </w:tr>
+      <w:tr>
+        <w:tc>
+          <w:tcPr>
+            <w:tcW w:type="dxa" w:w="4824"/>
+            <w:vAlign w:val="center"/>
+            <w:tcMar>
+              <w:top w:w="90" w:type="dxa"/>
+              <w:start w:w="110" w:type="dxa"/>
+              <w:bottom w:w="90" w:type="dxa"/>
+              <w:end w:w="110" w:type="dxa"/>
+            </w:tcMar>
+            <w:tcBorders>
+              <w:top w:val="single" w:sz="4" w:color="D9D9D9"/>
+              <w:left w:val="single" w:sz="4" w:color="D9D9D9"/>
+              <w:bottom w:val="single" w:sz="4" w:color="D9D9D9"/>
+              <w:right w:val="single" w:sz="4" w:color="D9D9D9"/>
+              <w:insideH w:val="single" w:sz="4" w:color="D9D9D9"/>
+              <w:insideV w:val="single" w:sz="4" w:color="D9D9D9"/>
+            </w:tcBorders>
+            <w:shd w:fill="FFFFFF"/>
+          </w:tcPr>
+          <w:p>
+            <w:pPr>
+              <w:spacing w:after="0" w:line="252" w:lineRule="auto"/>
+            </w:pPr>
+            <w:r>
+              <w:rPr>
+                <w:rFonts w:ascii="Georgia" w:hAnsi="Georgia" w:eastAsia="Georgia"/>
+                <w:sz w:val="18"/>
+              </w:rPr>
+              <w:t>Prepare the final document</w:t>
+            </w:r>
+          </w:p>
+        </w:tc>
+        <w:tc>
+          <w:tcPr>
+            <w:tcW w:type="dxa" w:w="4824"/>
+            <w:vAlign w:val="center"/>
+            <w:tcMar>
+              <w:top w:w="90" w:type="dxa"/>
+              <w:start w:w="110" w:type="dxa"/>
+              <w:bottom w:w="90" w:type="dxa"/>
+              <w:end w:w="110" w:type="dxa"/>
+            </w:tcMar>
+            <w:tcBorders>
+              <w:top w:val="single" w:sz="4" w:color="D9D9D9"/>
+              <w:left w:val="single" w:sz="4" w:color="D9D9D9"/>
+              <w:bottom w:val="single" w:sz="4" w:color="D9D9D9"/>
+              <w:right w:val="single" w:sz="4" w:color="D9D9D9"/>
+              <w:insideH w:val="single" w:sz="4" w:color="D9D9D9"/>
+              <w:insideV w:val="single" w:sz="4" w:color="D9D9D9"/>
+            </w:tcBorders>
+            <w:shd w:fill="FFFFFF"/>
+          </w:tcPr>
+          <w:p>
+            <w:pPr>
+              <w:spacing w:after="0" w:line="252" w:lineRule="auto"/>
+            </w:pPr>
+            <w:r>
+              <w:rPr>
+                <w:rFonts w:ascii="Georgia" w:hAnsi="Georgia" w:eastAsia="Georgia"/>
+                <w:sz w:val="18"/>
+              </w:rPr>
+              <w:t>A reviewer confirms one saved snapshot before PDF export</w:t>
+            </w:r>
+          </w:p>
+        </w:tc>
+      </w:tr>
+    </w:tbl>
+    <w:p>
+      <w:pPr>
+        <w:spacing w:after="0"/>
+      </w:pPr>
+    </w:p>
+    <w:p>
+      <w:pPr>
+        <w:pStyle w:val="Heading1"/>
+      </w:pPr>
+      <w:r>
+        <w:rPr>
+          <w:rFonts w:ascii="Arial" w:hAnsi="Arial" w:eastAsia="Arial"/>
+          <w:color w:val="000000"/>
+          <w:sz w:val="30"/>
+        </w:rPr>
+        <w:t>Outcome shown in the prototype</w:t>
       </w:r>
     </w:p>
     <w:p>
+      <w:pPr>
+        <w:widowControl/>
+      </w:pPr>
       <w:r>
         <w:rPr>
-          <w:b w:val="0"/>
-          <w:i w:val="0"/>
+          <w:rFonts w:ascii="Georgia" w:hAnsi="Georgia" w:eastAsia="Georgia"/>
+          <w:sz w:val="21"/>
         </w:rPr>
-        <w:t>In the target manual workflow, staff clarify the enquiry, search documents, compare specifications, calculate a price, seek approval, and prepare a PDF. In the workbench, the Agent asks the missing question and retrieves candidates with their source pages. A person chooses the SKU; the pricing tool calculates the draft. The user saves a version, reviews any revision, and confirms the chosen version before PDF export. The prototype records the confirmer's name but does not enforce approval roles.</w:t>
-      </w:r>
-    </w:p>
-    <w:p>
-      <w:r>
-        <w:rPr>
-          <w:b w:val="0"/>
-          <w:i w:val="0"/>
-        </w:rPr>
-        <w:t>The eight-monitor example shows the division of work. The Agent asks whether the customer needs video over USB-C and laptop power. Once the customer accepts the relevant specification and the user selects Dell P2425HE, the synthetic catalogue price of SGD 289 per unit produces an SGD 2,312 draft at zero discount. At ten units, the total is SGD 2,890, or SGD 390 above the stated budget. The workbench stores both versions and shows the difference. These are demonstration amounts from the project's synthetic price list, not a sales offer or Dell pricing.</w:t>
-      </w:r>
-    </w:p>
-    <w:p>
-      <w:r>
-        <w:rPr>
-          <w:b w:val="0"/>
-          <w:i w:val="0"/>
-        </w:rPr>
-        <w:t>A second case concerns Dell U2724D. Its USB-C upstream connection is data-only, so it cannot meet a one-cable video and 90 W laptop-charging request. The catalogue can show U2724DE as a possible alternative, with source evidence, but a person must select it. A third case asks for a 6% discount and next-day delivery. The demo rule caps discounts at 5%, and the dataset has no delivery lead time. The system reports those limits instead of calculating an unauthorized discounted quote or promising a delivery date.</w:t>
+        <w:t>The first browser outcome starts with a broad office request: around eight monitors, one USB-C cable for video and charging, and a budget of about SGD 2,500. The system finds 18 technically compatible records but does not treat that as a recommendation. It asks for the minimum charging wattage, screen preference, and exact quantity. Product selection remains disabled until those details are supplied.</w:t>
       </w:r>
     </w:p>
     <w:p>
       <w:pPr>
         <w:keepNext/>
-        <w:spacing w:before="140" w:after="60"/>
+        <w:spacing w:before="100" w:after="80"/>
         <w:jc w:val="center"/>
       </w:pPr>
       <w:r>
         <w:drawing>
           <wp:inline xmlns:a="http://schemas.openxmlformats.org/drawingml/2006/main" xmlns:pic="http://schemas.openxmlformats.org/drawingml/2006/picture">
-            <wp:extent cx="5989320" cy="3930491"/>
-            <wp:docPr id="1" name="Picture 1" descr="Browser acceptance screenshot showing the saved quote comparison and its line-level changes"/>
+            <wp:extent cx="6309360" cy="4140518"/>
+            <wp:docPr id="1" name="Picture 1" descr="A broad office enquiry triggers three clarification questions and a provisional product shortlist"/>
             <wp:cNvGraphicFramePr>
               <a:graphicFrameLocks noChangeAspect="1"/>
             </wp:cNvGraphicFramePr>
@@ -195,11 +712,11 @@
               <a:graphicData uri="http://schemas.openxmlformats.org/drawingml/2006/picture">
                 <pic:pic>
                   <pic:nvPicPr>
-                    <pic:cNvPr id="0" name="quote-version-comparison.png"/>
+                    <pic:cNvPr id="0" name="image.png"/>
                     <pic:cNvPicPr/>
                   </pic:nvPicPr>
                   <pic:blipFill>
-                    <a:blip r:embed="rId9"/>
+                    <a:blip r:embed="rId17"/>
                     <a:stretch>
                       <a:fillRect/>
                     </a:stretch>
@@ -207,7 +724,7 @@
                   <pic:spPr>
                     <a:xfrm>
                       <a:off x="0" y="0"/>
-                      <a:ext cx="5989320" cy="3930491"/>
+                      <a:ext cx="6309360" cy="4140518"/>
                     </a:xfrm>
                     <a:prstGeom prst="rect"/>
                   </pic:spPr>
@@ -220,17 +737,114 @@
     </w:p>
     <w:p>
       <w:pPr>
-        <w:keepLines/>
-        <w:spacing w:after="180"/>
+        <w:pStyle w:val="Caption"/>
+        <w:spacing w:after="160"/>
+        <w:jc w:val="center"/>
       </w:pPr>
       <w:r>
         <w:rPr>
+          <w:rFonts w:ascii="Georgia" w:hAnsi="Georgia" w:eastAsia="Georgia"/>
           <w:b w:val="0"/>
-          <w:i w:val="0"/>
-          <w:color w:val="46505A"/>
-          <w:sz w:val="17"/>
+          <w:sz w:val="21"/>
         </w:rPr>
-        <w:t>Figure 1. In the v2 browser acceptance run, changing P2425HE from eight to ten units produced a second saved draft. The comparison shows SGD 2,312 before, SGD 2,890 after, and a SGD 578 change. The revised total is SGD 390 above the original SGD 2,500 budget. This screenshot demonstrates the offline browser flow; the v2 Gateway evaluation remains pending.</w:t>
+        <w:t>Figure 1. The workbench separates a plausible match from a quote-ready decision. It displays three provisional products, source links, and estimated totals while keeping selection locked until the missing requirements are confirmed.</w:t>
+      </w:r>
+    </w:p>
+    <w:p>
+      <w:pPr>
+        <w:widowControl/>
+      </w:pPr>
+      <w:r>
+        <w:rPr>
+          <w:rFonts w:ascii="Georgia" w:hAnsi="Georgia" w:eastAsia="Georgia"/>
+          <w:sz w:val="21"/>
+        </w:rPr>
+        <w:t>After the user confirms exactly eight units, at least 90 W charging, and a 24-inch FHD preference, the catalogue returns three matching models. The user can then select a product. Selecting from a product card starts a one-unit draft by design; the interface warns that the original enquiry mentioned eight units and offers a direct way to restore that quantity.</w:t>
+      </w:r>
+    </w:p>
+    <w:p>
+      <w:r>
+        <w:br w:type="page"/>
+      </w:r>
+    </w:p>
+    <w:p>
+      <w:pPr>
+        <w:widowControl/>
+      </w:pPr>
+      <w:r>
+        <w:rPr>
+          <w:rFonts w:ascii="Georgia" w:hAnsi="Georgia" w:eastAsia="Georgia"/>
+          <w:sz w:val="21"/>
+        </w:rPr>
+        <w:t>For Dell P2425HE, the synthetic unit price is SGD 289. Eight units produce an SGD 2,312 draft at zero discount. Changing the quantity to ten produces SGD 2,890, which is SGD 390 above the stated budget. The comparison records the SGD 578 increase and leaves the first saved draft unchanged.</w:t>
+      </w:r>
+    </w:p>
+    <w:p>
+      <w:pPr>
+        <w:keepNext/>
+        <w:spacing w:before="100" w:after="80"/>
+        <w:jc w:val="center"/>
+      </w:pPr>
+      <w:r>
+        <w:drawing>
+          <wp:inline xmlns:a="http://schemas.openxmlformats.org/drawingml/2006/main" xmlns:pic="http://schemas.openxmlformats.org/drawingml/2006/picture">
+            <wp:extent cx="6309360" cy="4140518"/>
+            <wp:docPr id="2" name="Picture 2" descr="The saved draft comparison records an eight-to-ten unit change and a SGD 578 increase"/>
+            <wp:cNvGraphicFramePr>
+              <a:graphicFrameLocks noChangeAspect="1"/>
+            </wp:cNvGraphicFramePr>
+            <a:graphic>
+              <a:graphicData uri="http://schemas.openxmlformats.org/drawingml/2006/picture">
+                <pic:pic>
+                  <pic:nvPicPr>
+                    <pic:cNvPr id="0" name="image.png"/>
+                    <pic:cNvPicPr/>
+                  </pic:nvPicPr>
+                  <pic:blipFill>
+                    <a:blip r:embed="rId18"/>
+                    <a:stretch>
+                      <a:fillRect/>
+                    </a:stretch>
+                  </pic:blipFill>
+                  <pic:spPr>
+                    <a:xfrm>
+                      <a:off x="0" y="0"/>
+                      <a:ext cx="6309360" cy="4140518"/>
+                    </a:xfrm>
+                    <a:prstGeom prst="rect"/>
+                  </pic:spPr>
+                </pic:pic>
+              </a:graphicData>
+            </a:graphic>
+          </wp:inline>
+        </w:drawing>
+      </w:r>
+    </w:p>
+    <w:p>
+      <w:pPr>
+        <w:pStyle w:val="Caption"/>
+        <w:spacing w:after="160"/>
+        <w:jc w:val="center"/>
+      </w:pPr>
+      <w:r>
+        <w:rPr>
+          <w:rFonts w:ascii="Georgia" w:hAnsi="Georgia" w:eastAsia="Georgia"/>
+          <w:b w:val="0"/>
+          <w:sz w:val="21"/>
+        </w:rPr>
+        <w:t>Figure 2. The browser reads both totals from stored snapshots. The confirmed PDF is generated from the selected snapshot rather than from a fresh model response.</w:t>
+      </w:r>
+    </w:p>
+    <w:p>
+      <w:pPr>
+        <w:widowControl/>
+      </w:pPr>
+      <w:r>
+        <w:rPr>
+          <w:rFonts w:ascii="Georgia" w:hAnsi="Georgia" w:eastAsia="Georgia"/>
+          <w:sz w:val="21"/>
+        </w:rPr>
+        <w:t>Two additional test cases cover common quotation risks. Dell U2724D has a data-only USB-C upstream connection, so it cannot satisfy a one-cable video and 90 W laptop-charging request. The system can show U2724DE as a sourced alternative, but it cannot select it for the user. A separate request for a 6% discount and next-day delivery is blocked because the demo limit is 5% and the catalogue has no delivery lead-time data.</w:t>
       </w:r>
     </w:p>
     <w:p>
@@ -239,37 +853,52 @@
       </w:pPr>
       <w:r>
         <w:rPr>
-          <w:b w:val="0"/>
-          <w:i w:val="0"/>
+          <w:rFonts w:ascii="Arial" w:hAnsi="Arial" w:eastAsia="Arial"/>
+          <w:color w:val="000000"/>
+          <w:sz w:val="30"/>
         </w:rPr>
-        <w:t>Why an Agent belongs in this workflow</w:t>
+        <w:t>Why an Agent is used</w:t>
+      </w:r>
+    </w:p>
+    <w:p>
+      <w:pPr>
+        <w:widowControl/>
+      </w:pPr>
+      <w:r>
+        <w:rPr>
+          <w:rFonts w:ascii="Georgia" w:hAnsi="Georgia" w:eastAsia="Georgia"/>
+          <w:sz w:val="21"/>
+        </w:rPr>
+        <w:t>Customer wording varies, and missing requirements are rarely expressed as form fields. The Agent translates that wording into structured searches and focused questions. It can call three tools: search the catalogue, retrieve one product with field-level evidence, and calculate a draft.</w:t>
+      </w:r>
+    </w:p>
+    <w:p>
+      <w:pPr>
+        <w:widowControl/>
+      </w:pPr>
+      <w:r>
+        <w:rPr>
+          <w:rFonts w:ascii="Georgia" w:hAnsi="Georgia" w:eastAsia="Georgia"/>
+          <w:sz w:val="21"/>
+        </w:rPr>
+        <w:t>The Agent does not own the commercial facts. Search filters distinguish USB-C video input from host power and accessory charging. Missing data cannot satisfy a requirement, and a similar model name cannot replace the requested model. The pricing tool uses integer cents, applies one rounding rule, and rejects discounts above the configured limit.</w:t>
+      </w:r>
+    </w:p>
+    <w:p>
+      <w:pPr>
+        <w:widowControl/>
+      </w:pPr>
+      <w:r>
+        <w:rPr>
+          <w:rFonts w:ascii="Georgia" w:hAnsi="Georgia" w:eastAsia="Georgia"/>
+          <w:sz w:val="21"/>
+        </w:rPr>
+        <w:t>SQLite stores each saved draft and records confirmation separately. The PDF reads the confirmed snapshot, so later conversation turns cannot alter its figures. Staff can inspect the tool trace, source links, and saved-draft history. The page also shows when the organizer's LLM Gateway falls back to the deterministic offline path; fallback runs are excluded from real-model evaluation.</w:t>
       </w:r>
     </w:p>
     <w:p>
       <w:r>
-        <w:rPr>
-          <w:b w:val="0"/>
-          <w:i w:val="0"/>
-        </w:rPr>
-        <w:t>Customer language varies, so the Agent interprets the enquiry and asks for missing requirements. It can call three tools: search products, retrieve a product with evidence for each important field, and calculate a draft. Filters distinguish USB-C video input from laptop power and accessory charging. Missing data cannot satisfy a requirement, and a similar model name cannot replace the requested model.</w:t>
-      </w:r>
-    </w:p>
-    <w:p>
-      <w:r>
-        <w:rPr>
-          <w:b w:val="0"/>
-          <w:i w:val="0"/>
-        </w:rPr>
-        <w:t>Product facts and prices come from the catalogue and pricing rules, not the Agent's wording. The price tool calculates in integer cents, rounds each line's discount consistently, and rejects discounts above 5%. SQLite keeps each saved version; confirmation is recorded separately. The PDF reads the confirmed version, so a later conversation cannot change its figures. Staff can inspect the tool trace and version history. Live commercial use would require permission checks for the confirmation step.</w:t>
-      </w:r>
-    </w:p>
-    <w:p>
-      <w:r>
-        <w:rPr>
-          <w:b w:val="0"/>
-          <w:i w:val="0"/>
-        </w:rPr>
-        <w:t>The workbench runs on AWS Lightsail. It sends model requests through the organizer's LLM Gateway. If that service fails, the page marks its offline fallback; those results are excluded from real-model evaluation. The model handles language, while the catalogue, price tool, and human confirmation control the quote.</w:t>
+        <w:br w:type="page"/>
       </w:r>
     </w:p>
     <w:p>
@@ -278,28 +907,35 @@
       </w:pPr>
       <w:r>
         <w:rPr>
-          <w:b w:val="0"/>
-          <w:i w:val="0"/>
+          <w:rFonts w:ascii="Arial" w:hAnsi="Arial" w:eastAsia="Arial"/>
+          <w:color w:val="000000"/>
+          <w:sz w:val="30"/>
         </w:rPr>
-        <w:t>Business value and how to measure it</w:t>
+        <w:t>Business value and measurement</w:t>
       </w:r>
     </w:p>
     <w:p>
+      <w:pPr>
+        <w:widowControl/>
+      </w:pPr>
       <w:r>
         <w:rPr>
-          <w:b w:val="0"/>
-          <w:i w:val="0"/>
+          <w:rFonts w:ascii="Georgia" w:hAnsi="Georgia" w:eastAsia="Georgia"/>
+          <w:sz w:val="21"/>
         </w:rPr>
-        <w:t>The workbench brings specifications, price calculations, and draft versions into one place. Staff can check a product choice against its source page and see how a revised price differs from an earlier one. The pilot will measure whether these features reduce preparation time and rework.</w:t>
+        <w:t>Quotation Desk puts requirement clarification, product evidence, price calculation, and draft history in one workbench. The pilot will test whether that reduces preparation time and rework without weakening review.</w:t>
       </w:r>
     </w:p>
     <w:p>
+      <w:pPr>
+        <w:widowControl/>
+      </w:pPr>
       <w:r>
         <w:rPr>
-          <w:b w:val="0"/>
-          <w:i w:val="0"/>
+          <w:rFonts w:ascii="Georgia" w:hAnsi="Georgia" w:eastAsia="Georgia"/>
+          <w:sz w:val="21"/>
         </w:rPr>
-        <w:t>The pilot should compare manual and assisted work on the same five de-identified cases, with the same catalogue and pricing rules. Timing starts when the operator reads the enquiry and ends when a result is ready for review. An Agent response counts only if its SKU choice, calculation, or policy block is correct. Report sample size, median, and range for each method, along with any manual corrections. The pilot will measure the actual difference; no percentage saving is assumed in advance.</w:t>
+        <w:t>The employee should complete the same five de-identified cases manually and with Quotation Desk, using the same catalogue and pricing rules. Timing starts when the employee reads the enquiry and ends when a draft is ready for review. A result counts as correct only when the product choice, calculation, and policy handling are correct. The pilot report should include the sample size, median, range, and all manual corrections for both methods.</w:t>
       </w:r>
     </w:p>
     <w:tbl>
@@ -310,41 +946,44 @@
         <w:tblLook w:firstColumn="1" w:firstRow="1" w:lastColumn="0" w:lastRow="0" w:noHBand="0" w:noVBand="1" w:val="04A0"/>
       </w:tblPr>
       <w:tblGrid>
-        <w:gridCol w:w="3221"/>
-        <w:gridCol w:w="3221"/>
-        <w:gridCol w:w="3221"/>
+        <w:gridCol w:w="3389"/>
+        <w:gridCol w:w="3389"/>
+        <w:gridCol w:w="3389"/>
       </w:tblGrid>
       <w:tr>
         <w:trPr>
-          <w:tblHeader w:val="true"/>
+          <w:tblHeader/>
         </w:trPr>
         <w:tc>
           <w:tcPr>
-            <w:tcW w:type="dxa" w:w="2088"/>
+            <w:tcW w:type="dxa" w:w="1944"/>
             <w:vAlign w:val="center"/>
-            <w:tcBorders>
-              <w:top w:val="single" w:sz="4" w:color="D9D9D9"/>
-              <w:left w:val="single" w:sz="4" w:color="D9D9D9"/>
-              <w:bottom w:val="single" w:sz="4" w:color="D9D9D9"/>
-              <w:right w:val="single" w:sz="4" w:color="D9D9D9"/>
-            </w:tcBorders>
             <w:tcMar>
               <w:top w:w="90" w:type="dxa"/>
               <w:start w:w="110" w:type="dxa"/>
               <w:bottom w:w="90" w:type="dxa"/>
               <w:end w:w="110" w:type="dxa"/>
             </w:tcMar>
-            <w:shd w:fill="E9EEF3"/>
+            <w:tcBorders>
+              <w:top w:val="single" w:sz="4" w:color="D9D9D9"/>
+              <w:left w:val="single" w:sz="4" w:color="D9D9D9"/>
+              <w:bottom w:val="single" w:sz="4" w:color="D9D9D9"/>
+              <w:right w:val="single" w:sz="4" w:color="D9D9D9"/>
+              <w:insideH w:val="single" w:sz="4" w:color="D9D9D9"/>
+              <w:insideV w:val="single" w:sz="4" w:color="D9D9D9"/>
+            </w:tcBorders>
+            <w:shd w:fill="102A43"/>
           </w:tcPr>
           <w:p>
             <w:pPr>
-              <w:spacing w:after="0" w:line="259" w:lineRule="auto"/>
+              <w:spacing w:after="0" w:line="252" w:lineRule="auto"/>
             </w:pPr>
             <w:r>
               <w:rPr>
+                <w:rFonts w:ascii="Arial" w:hAnsi="Arial" w:eastAsia="Arial"/>
                 <w:b/>
-                <w:i w:val="0"/>
-                <w:sz w:val="17"/>
+                <w:color w:val="FFFFFF"/>
+                <w:sz w:val="18"/>
               </w:rPr>
               <w:t>Outcome</w:t>
             </w:r>
@@ -352,31 +991,34 @@
         </w:tc>
         <w:tc>
           <w:tcPr>
-            <w:tcW w:type="dxa" w:w="3456"/>
+            <w:tcW w:type="dxa" w:w="3672"/>
             <w:vAlign w:val="center"/>
-            <w:tcBorders>
-              <w:top w:val="single" w:sz="4" w:color="D9D9D9"/>
-              <w:left w:val="single" w:sz="4" w:color="D9D9D9"/>
-              <w:bottom w:val="single" w:sz="4" w:color="D9D9D9"/>
-              <w:right w:val="single" w:sz="4" w:color="D9D9D9"/>
-            </w:tcBorders>
             <w:tcMar>
               <w:top w:w="90" w:type="dxa"/>
               <w:start w:w="110" w:type="dxa"/>
               <w:bottom w:w="90" w:type="dxa"/>
               <w:end w:w="110" w:type="dxa"/>
             </w:tcMar>
-            <w:shd w:fill="E9EEF3"/>
+            <w:tcBorders>
+              <w:top w:val="single" w:sz="4" w:color="D9D9D9"/>
+              <w:left w:val="single" w:sz="4" w:color="D9D9D9"/>
+              <w:bottom w:val="single" w:sz="4" w:color="D9D9D9"/>
+              <w:right w:val="single" w:sz="4" w:color="D9D9D9"/>
+              <w:insideH w:val="single" w:sz="4" w:color="D9D9D9"/>
+              <w:insideV w:val="single" w:sz="4" w:color="D9D9D9"/>
+            </w:tcBorders>
+            <w:shd w:fill="102A43"/>
           </w:tcPr>
           <w:p>
             <w:pPr>
-              <w:spacing w:after="0" w:line="259" w:lineRule="auto"/>
+              <w:spacing w:after="0" w:line="252" w:lineRule="auto"/>
             </w:pPr>
             <w:r>
               <w:rPr>
+                <w:rFonts w:ascii="Arial" w:hAnsi="Arial" w:eastAsia="Arial"/>
                 <w:b/>
-                <w:i w:val="0"/>
-                <w:sz w:val="17"/>
+                <w:color w:val="FFFFFF"/>
+                <w:sz w:val="18"/>
               </w:rPr>
               <w:t>Evidence available now</w:t>
             </w:r>
@@ -384,31 +1026,34 @@
         </w:tc>
         <w:tc>
           <w:tcPr>
-            <w:tcW w:type="dxa" w:w="4104"/>
+            <w:tcW w:type="dxa" w:w="4032"/>
             <w:vAlign w:val="center"/>
-            <w:tcBorders>
-              <w:top w:val="single" w:sz="4" w:color="D9D9D9"/>
-              <w:left w:val="single" w:sz="4" w:color="D9D9D9"/>
-              <w:bottom w:val="single" w:sz="4" w:color="D9D9D9"/>
-              <w:right w:val="single" w:sz="4" w:color="D9D9D9"/>
-            </w:tcBorders>
             <w:tcMar>
               <w:top w:w="90" w:type="dxa"/>
               <w:start w:w="110" w:type="dxa"/>
               <w:bottom w:w="90" w:type="dxa"/>
               <w:end w:w="110" w:type="dxa"/>
             </w:tcMar>
-            <w:shd w:fill="E9EEF3"/>
+            <w:tcBorders>
+              <w:top w:val="single" w:sz="4" w:color="D9D9D9"/>
+              <w:left w:val="single" w:sz="4" w:color="D9D9D9"/>
+              <w:bottom w:val="single" w:sz="4" w:color="D9D9D9"/>
+              <w:right w:val="single" w:sz="4" w:color="D9D9D9"/>
+              <w:insideH w:val="single" w:sz="4" w:color="D9D9D9"/>
+              <w:insideV w:val="single" w:sz="4" w:color="D9D9D9"/>
+            </w:tcBorders>
+            <w:shd w:fill="102A43"/>
           </w:tcPr>
           <w:p>
             <w:pPr>
-              <w:spacing w:after="0" w:line="259" w:lineRule="auto"/>
+              <w:spacing w:after="0" w:line="252" w:lineRule="auto"/>
             </w:pPr>
             <w:r>
               <w:rPr>
+                <w:rFonts w:ascii="Arial" w:hAnsi="Arial" w:eastAsia="Arial"/>
                 <w:b/>
-                <w:i w:val="0"/>
-                <w:sz w:val="17"/>
+                <w:color w:val="FFFFFF"/>
+                <w:sz w:val="18"/>
               </w:rPr>
               <w:t>Pilot acceptance measure</w:t>
             </w:r>
@@ -418,30 +1063,32 @@
       <w:tr>
         <w:tc>
           <w:tcPr>
-            <w:tcW w:type="dxa" w:w="2088"/>
+            <w:tcW w:type="dxa" w:w="1944"/>
             <w:vAlign w:val="center"/>
-            <w:tcBorders>
-              <w:top w:val="single" w:sz="4" w:color="D9D9D9"/>
-              <w:left w:val="single" w:sz="4" w:color="D9D9D9"/>
-              <w:bottom w:val="single" w:sz="4" w:color="D9D9D9"/>
-              <w:right w:val="single" w:sz="4" w:color="D9D9D9"/>
-            </w:tcBorders>
             <w:tcMar>
               <w:top w:w="90" w:type="dxa"/>
               <w:start w:w="110" w:type="dxa"/>
               <w:bottom w:w="90" w:type="dxa"/>
               <w:end w:w="110" w:type="dxa"/>
             </w:tcMar>
+            <w:tcBorders>
+              <w:top w:val="single" w:sz="4" w:color="D9D9D9"/>
+              <w:left w:val="single" w:sz="4" w:color="D9D9D9"/>
+              <w:bottom w:val="single" w:sz="4" w:color="D9D9D9"/>
+              <w:right w:val="single" w:sz="4" w:color="D9D9D9"/>
+              <w:insideH w:val="single" w:sz="4" w:color="D9D9D9"/>
+              <w:insideV w:val="single" w:sz="4" w:color="D9D9D9"/>
+            </w:tcBorders>
+            <w:shd w:fill="FFFFFF"/>
           </w:tcPr>
           <w:p>
             <w:pPr>
-              <w:spacing w:after="0" w:line="259" w:lineRule="auto"/>
+              <w:spacing w:after="0" w:line="252" w:lineRule="auto"/>
             </w:pPr>
             <w:r>
               <w:rPr>
-                <w:b w:val="0"/>
-                <w:i w:val="0"/>
-                <w:sz w:val="17"/>
+                <w:rFonts w:ascii="Georgia" w:hAnsi="Georgia" w:eastAsia="Georgia"/>
+                <w:sz w:val="18"/>
               </w:rPr>
               <w:t>Preparation time</w:t>
             </w:r>
@@ -449,63 +1096,67 @@
         </w:tc>
         <w:tc>
           <w:tcPr>
-            <w:tcW w:type="dxa" w:w="3456"/>
+            <w:tcW w:type="dxa" w:w="3672"/>
             <w:vAlign w:val="center"/>
-            <w:tcBorders>
-              <w:top w:val="single" w:sz="4" w:color="D9D9D9"/>
-              <w:left w:val="single" w:sz="4" w:color="D9D9D9"/>
-              <w:bottom w:val="single" w:sz="4" w:color="D9D9D9"/>
-              <w:right w:val="single" w:sz="4" w:color="D9D9D9"/>
-            </w:tcBorders>
             <w:tcMar>
               <w:top w:w="90" w:type="dxa"/>
               <w:start w:w="110" w:type="dxa"/>
               <w:bottom w:w="90" w:type="dxa"/>
               <w:end w:w="110" w:type="dxa"/>
             </w:tcMar>
+            <w:tcBorders>
+              <w:top w:val="single" w:sz="4" w:color="D9D9D9"/>
+              <w:left w:val="single" w:sz="4" w:color="D9D9D9"/>
+              <w:bottom w:val="single" w:sz="4" w:color="D9D9D9"/>
+              <w:right w:val="single" w:sz="4" w:color="D9D9D9"/>
+              <w:insideH w:val="single" w:sz="4" w:color="D9D9D9"/>
+              <w:insideV w:val="single" w:sz="4" w:color="D9D9D9"/>
+            </w:tcBorders>
+            <w:shd w:fill="FFFFFF"/>
           </w:tcPr>
           <w:p>
             <w:pPr>
-              <w:spacing w:after="0" w:line="259" w:lineRule="auto"/>
+              <w:spacing w:after="0" w:line="252" w:lineRule="auto"/>
             </w:pPr>
             <w:r>
               <w:rPr>
-                <w:b w:val="0"/>
-                <w:i w:val="0"/>
-                <w:sz w:val="17"/>
+                <w:rFonts w:ascii="Georgia" w:hAnsi="Georgia" w:eastAsia="Georgia"/>
+                <w:sz w:val="18"/>
               </w:rPr>
-              <w:t>A five-case v1 Gateway run had a 12.705-second median Agent response. Human timing is pending; this timing excludes the full staff review and approval journey.</w:t>
+              <w:t>Five correct organizer Gateway cases had a median Agent response of 12.705 seconds, with a 9.025 to 19.633 second range. Human timing and the full review journey remain unmeasured.</w:t>
             </w:r>
           </w:p>
         </w:tc>
         <w:tc>
           <w:tcPr>
-            <w:tcW w:type="dxa" w:w="4104"/>
+            <w:tcW w:type="dxa" w:w="4032"/>
             <w:vAlign w:val="center"/>
-            <w:tcBorders>
-              <w:top w:val="single" w:sz="4" w:color="D9D9D9"/>
-              <w:left w:val="single" w:sz="4" w:color="D9D9D9"/>
-              <w:bottom w:val="single" w:sz="4" w:color="D9D9D9"/>
-              <w:right w:val="single" w:sz="4" w:color="D9D9D9"/>
-            </w:tcBorders>
             <w:tcMar>
               <w:top w:w="90" w:type="dxa"/>
               <w:start w:w="110" w:type="dxa"/>
               <w:bottom w:w="90" w:type="dxa"/>
               <w:end w:w="110" w:type="dxa"/>
             </w:tcMar>
+            <w:tcBorders>
+              <w:top w:val="single" w:sz="4" w:color="D9D9D9"/>
+              <w:left w:val="single" w:sz="4" w:color="D9D9D9"/>
+              <w:bottom w:val="single" w:sz="4" w:color="D9D9D9"/>
+              <w:right w:val="single" w:sz="4" w:color="D9D9D9"/>
+              <w:insideH w:val="single" w:sz="4" w:color="D9D9D9"/>
+              <w:insideV w:val="single" w:sz="4" w:color="D9D9D9"/>
+            </w:tcBorders>
+            <w:shd w:fill="FFFFFF"/>
           </w:tcPr>
           <w:p>
             <w:pPr>
-              <w:spacing w:after="0" w:line="259" w:lineRule="auto"/>
+              <w:spacing w:after="0" w:line="252" w:lineRule="auto"/>
             </w:pPr>
             <w:r>
               <w:rPr>
-                <w:b w:val="0"/>
-                <w:i w:val="0"/>
-                <w:sz w:val="17"/>
+                <w:rFonts w:ascii="Georgia" w:hAnsi="Georgia" w:eastAsia="Georgia"/>
+                <w:sz w:val="18"/>
               </w:rPr>
-              <w:t>Measure matched manual and assisted cases; report both medians, ranges, and the observed difference.</w:t>
+              <w:t>Compare matched manual and assisted cases and report both distributions.</w:t>
             </w:r>
           </w:p>
         </w:tc>
@@ -513,31 +1164,32 @@
       <w:tr>
         <w:tc>
           <w:tcPr>
-            <w:tcW w:type="dxa" w:w="2088"/>
+            <w:tcW w:type="dxa" w:w="1944"/>
             <w:vAlign w:val="center"/>
-            <w:tcBorders>
-              <w:top w:val="single" w:sz="4" w:color="D9D9D9"/>
-              <w:left w:val="single" w:sz="4" w:color="D9D9D9"/>
-              <w:bottom w:val="single" w:sz="4" w:color="D9D9D9"/>
-              <w:right w:val="single" w:sz="4" w:color="D9D9D9"/>
-            </w:tcBorders>
             <w:tcMar>
               <w:top w:w="90" w:type="dxa"/>
               <w:start w:w="110" w:type="dxa"/>
               <w:bottom w:w="90" w:type="dxa"/>
               <w:end w:w="110" w:type="dxa"/>
             </w:tcMar>
-            <w:shd w:fill="F8FAFC"/>
+            <w:tcBorders>
+              <w:top w:val="single" w:sz="4" w:color="D9D9D9"/>
+              <w:left w:val="single" w:sz="4" w:color="D9D9D9"/>
+              <w:bottom w:val="single" w:sz="4" w:color="D9D9D9"/>
+              <w:right w:val="single" w:sz="4" w:color="D9D9D9"/>
+              <w:insideH w:val="single" w:sz="4" w:color="D9D9D9"/>
+              <w:insideV w:val="single" w:sz="4" w:color="D9D9D9"/>
+            </w:tcBorders>
+            <w:shd w:fill="F2F6FA"/>
           </w:tcPr>
           <w:p>
             <w:pPr>
-              <w:spacing w:after="0" w:line="259" w:lineRule="auto"/>
+              <w:spacing w:after="0" w:line="252" w:lineRule="auto"/>
             </w:pPr>
             <w:r>
               <w:rPr>
-                <w:b w:val="0"/>
-                <w:i w:val="0"/>
-                <w:sz w:val="17"/>
+                <w:rFonts w:ascii="Georgia" w:hAnsi="Georgia" w:eastAsia="Georgia"/>
+                <w:sz w:val="18"/>
               </w:rPr>
               <w:t>Price accuracy</w:t>
             </w:r>
@@ -545,63 +1197,65 @@
         </w:tc>
         <w:tc>
           <w:tcPr>
-            <w:tcW w:type="dxa" w:w="3456"/>
+            <w:tcW w:type="dxa" w:w="3672"/>
             <w:vAlign w:val="center"/>
-            <w:tcBorders>
-              <w:top w:val="single" w:sz="4" w:color="D9D9D9"/>
-              <w:left w:val="single" w:sz="4" w:color="D9D9D9"/>
-              <w:bottom w:val="single" w:sz="4" w:color="D9D9D9"/>
-              <w:right w:val="single" w:sz="4" w:color="D9D9D9"/>
-            </w:tcBorders>
             <w:tcMar>
               <w:top w:w="90" w:type="dxa"/>
               <w:start w:w="110" w:type="dxa"/>
               <w:bottom w:w="90" w:type="dxa"/>
               <w:end w:w="110" w:type="dxa"/>
             </w:tcMar>
-            <w:shd w:fill="F8FAFC"/>
+            <w:tcBorders>
+              <w:top w:val="single" w:sz="4" w:color="D9D9D9"/>
+              <w:left w:val="single" w:sz="4" w:color="D9D9D9"/>
+              <w:bottom w:val="single" w:sz="4" w:color="D9D9D9"/>
+              <w:right w:val="single" w:sz="4" w:color="D9D9D9"/>
+              <w:insideH w:val="single" w:sz="4" w:color="D9D9D9"/>
+              <w:insideV w:val="single" w:sz="4" w:color="D9D9D9"/>
+            </w:tcBorders>
+            <w:shd w:fill="F2F6FA"/>
           </w:tcPr>
           <w:p>
             <w:pPr>
-              <w:spacing w:after="0" w:line="259" w:lineRule="auto"/>
+              <w:spacing w:after="0" w:line="252" w:lineRule="auto"/>
             </w:pPr>
             <w:r>
               <w:rPr>
-                <w:b w:val="0"/>
-                <w:i w:val="0"/>
-                <w:sz w:val="17"/>
+                <w:rFonts w:ascii="Georgia" w:hAnsi="Georgia" w:eastAsia="Georgia"/>
+                <w:sz w:val="18"/>
               </w:rPr>
-              <w:t>The pricing rules and saved-quote flow have automated checks; 15 v1 expected quote amounts were independently reconciled.</w:t>
+              <w:t>Automated tests cover pricing, saved snapshots, confirmation, PDF export, quantity revision, and independent amount reconciliation.</w:t>
             </w:r>
           </w:p>
         </w:tc>
         <w:tc>
           <w:tcPr>
-            <w:tcW w:type="dxa" w:w="4104"/>
+            <w:tcW w:type="dxa" w:w="4032"/>
             <w:vAlign w:val="center"/>
-            <w:tcBorders>
-              <w:top w:val="single" w:sz="4" w:color="D9D9D9"/>
-              <w:left w:val="single" w:sz="4" w:color="D9D9D9"/>
-              <w:bottom w:val="single" w:sz="4" w:color="D9D9D9"/>
-              <w:right w:val="single" w:sz="4" w:color="D9D9D9"/>
-            </w:tcBorders>
             <w:tcMar>
               <w:top w:w="90" w:type="dxa"/>
               <w:start w:w="110" w:type="dxa"/>
               <w:bottom w:w="90" w:type="dxa"/>
               <w:end w:w="110" w:type="dxa"/>
             </w:tcMar>
-            <w:shd w:fill="F8FAFC"/>
+            <w:tcBorders>
+              <w:top w:val="single" w:sz="4" w:color="D9D9D9"/>
+              <w:left w:val="single" w:sz="4" w:color="D9D9D9"/>
+              <w:bottom w:val="single" w:sz="4" w:color="D9D9D9"/>
+              <w:right w:val="single" w:sz="4" w:color="D9D9D9"/>
+              <w:insideH w:val="single" w:sz="4" w:color="D9D9D9"/>
+              <w:insideV w:val="single" w:sz="4" w:color="D9D9D9"/>
+            </w:tcBorders>
+            <w:shd w:fill="F2F6FA"/>
           </w:tcPr>
           <w:p>
             <w:pPr>
-              <w:spacing w:after="0" w:line="259" w:lineRule="auto"/>
+              <w:spacing w:after="0" w:line="252" w:lineRule="auto"/>
             </w:pPr>
             <w:r>
               <w:rPr>
-                <w:b w:val="0"/>
-                <w:i w:val="0"/>
-                <w:sz w:val="17"/>
+                <w:rFonts w:ascii="Georgia" w:hAnsi="Georgia" w:eastAsia="Georgia"/>
+                <w:sz w:val="18"/>
               </w:rPr>
               <w:t>Every pilot total matches an independent recalculation in cents.</w:t>
             </w:r>
@@ -611,30 +1265,32 @@
       <w:tr>
         <w:tc>
           <w:tcPr>
-            <w:tcW w:type="dxa" w:w="2088"/>
+            <w:tcW w:type="dxa" w:w="1944"/>
             <w:vAlign w:val="center"/>
-            <w:tcBorders>
-              <w:top w:val="single" w:sz="4" w:color="D9D9D9"/>
-              <w:left w:val="single" w:sz="4" w:color="D9D9D9"/>
-              <w:bottom w:val="single" w:sz="4" w:color="D9D9D9"/>
-              <w:right w:val="single" w:sz="4" w:color="D9D9D9"/>
-            </w:tcBorders>
             <w:tcMar>
               <w:top w:w="90" w:type="dxa"/>
               <w:start w:w="110" w:type="dxa"/>
               <w:bottom w:w="90" w:type="dxa"/>
               <w:end w:w="110" w:type="dxa"/>
             </w:tcMar>
+            <w:tcBorders>
+              <w:top w:val="single" w:sz="4" w:color="D9D9D9"/>
+              <w:left w:val="single" w:sz="4" w:color="D9D9D9"/>
+              <w:bottom w:val="single" w:sz="4" w:color="D9D9D9"/>
+              <w:right w:val="single" w:sz="4" w:color="D9D9D9"/>
+              <w:insideH w:val="single" w:sz="4" w:color="D9D9D9"/>
+              <w:insideV w:val="single" w:sz="4" w:color="D9D9D9"/>
+            </w:tcBorders>
+            <w:shd w:fill="FFFFFF"/>
           </w:tcPr>
           <w:p>
             <w:pPr>
-              <w:spacing w:after="0" w:line="259" w:lineRule="auto"/>
+              <w:spacing w:after="0" w:line="252" w:lineRule="auto"/>
             </w:pPr>
             <w:r>
               <w:rPr>
-                <w:b w:val="0"/>
-                <w:i w:val="0"/>
-                <w:sz w:val="17"/>
+                <w:rFonts w:ascii="Georgia" w:hAnsi="Georgia" w:eastAsia="Georgia"/>
+                <w:sz w:val="18"/>
               </w:rPr>
               <w:t>Specification traceability</w:t>
             </w:r>
@@ -642,63 +1298,67 @@
         </w:tc>
         <w:tc>
           <w:tcPr>
-            <w:tcW w:type="dxa" w:w="3456"/>
+            <w:tcW w:type="dxa" w:w="3672"/>
             <w:vAlign w:val="center"/>
-            <w:tcBorders>
-              <w:top w:val="single" w:sz="4" w:color="D9D9D9"/>
-              <w:left w:val="single" w:sz="4" w:color="D9D9D9"/>
-              <w:bottom w:val="single" w:sz="4" w:color="D9D9D9"/>
-              <w:right w:val="single" w:sz="4" w:color="D9D9D9"/>
-            </w:tcBorders>
             <w:tcMar>
               <w:top w:w="90" w:type="dxa"/>
               <w:start w:w="110" w:type="dxa"/>
               <w:bottom w:w="90" w:type="dxa"/>
               <w:end w:w="110" w:type="dxa"/>
             </w:tcMar>
+            <w:tcBorders>
+              <w:top w:val="single" w:sz="4" w:color="D9D9D9"/>
+              <w:left w:val="single" w:sz="4" w:color="D9D9D9"/>
+              <w:bottom w:val="single" w:sz="4" w:color="D9D9D9"/>
+              <w:right w:val="single" w:sz="4" w:color="D9D9D9"/>
+              <w:insideH w:val="single" w:sz="4" w:color="D9D9D9"/>
+              <w:insideV w:val="single" w:sz="4" w:color="D9D9D9"/>
+            </w:tcBorders>
+            <w:shd w:fill="FFFFFF"/>
           </w:tcPr>
           <w:p>
             <w:pPr>
-              <w:spacing w:after="0" w:line="259" w:lineRule="auto"/>
+              <w:spacing w:after="0" w:line="252" w:lineRule="auto"/>
             </w:pPr>
             <w:r>
               <w:rPr>
-                <w:b w:val="0"/>
-                <w:i w:val="0"/>
-                <w:sz w:val="17"/>
+                <w:rFonts w:ascii="Georgia" w:hAnsi="Georgia" w:eastAsia="Georgia"/>
+                <w:sz w:val="18"/>
               </w:rPr>
-              <w:t>The v2 catalogue has 50 SKUs and 400 field-level evidence records.</w:t>
+              <w:t>The catalogue contains 50 models and 400 field-level evidence records linked to 44 official source documents covering 754 pages.</w:t>
             </w:r>
           </w:p>
         </w:tc>
         <w:tc>
           <w:tcPr>
-            <w:tcW w:type="dxa" w:w="4104"/>
+            <w:tcW w:type="dxa" w:w="4032"/>
             <w:vAlign w:val="center"/>
-            <w:tcBorders>
-              <w:top w:val="single" w:sz="4" w:color="D9D9D9"/>
-              <w:left w:val="single" w:sz="4" w:color="D9D9D9"/>
-              <w:bottom w:val="single" w:sz="4" w:color="D9D9D9"/>
-              <w:right w:val="single" w:sz="4" w:color="D9D9D9"/>
-            </w:tcBorders>
             <w:tcMar>
               <w:top w:w="90" w:type="dxa"/>
               <w:start w:w="110" w:type="dxa"/>
               <w:bottom w:w="90" w:type="dxa"/>
               <w:end w:w="110" w:type="dxa"/>
             </w:tcMar>
+            <w:tcBorders>
+              <w:top w:val="single" w:sz="4" w:color="D9D9D9"/>
+              <w:left w:val="single" w:sz="4" w:color="D9D9D9"/>
+              <w:bottom w:val="single" w:sz="4" w:color="D9D9D9"/>
+              <w:right w:val="single" w:sz="4" w:color="D9D9D9"/>
+              <w:insideH w:val="single" w:sz="4" w:color="D9D9D9"/>
+              <w:insideV w:val="single" w:sz="4" w:color="D9D9D9"/>
+            </w:tcBorders>
+            <w:shd w:fill="FFFFFF"/>
           </w:tcPr>
           <w:p>
             <w:pPr>
-              <w:spacing w:after="0" w:line="259" w:lineRule="auto"/>
+              <w:spacing w:after="0" w:line="252" w:lineRule="auto"/>
             </w:pPr>
             <w:r>
               <w:rPr>
-                <w:b w:val="0"/>
-                <w:i w:val="0"/>
-                <w:sz w:val="17"/>
+                <w:rFonts w:ascii="Georgia" w:hAnsi="Georgia" w:eastAsia="Georgia"/>
+                <w:sz w:val="18"/>
               </w:rPr>
-              <w:t>Every specification used to justify a pilot recommendation has a manufacturer source and page.</w:t>
+              <w:t>Every specification used in a pilot recommendation has a manufacturer source and page.</w:t>
             </w:r>
           </w:p>
         </w:tc>
@@ -706,31 +1366,32 @@
       <w:tr>
         <w:tc>
           <w:tcPr>
-            <w:tcW w:type="dxa" w:w="2088"/>
+            <w:tcW w:type="dxa" w:w="1944"/>
             <w:vAlign w:val="center"/>
-            <w:tcBorders>
-              <w:top w:val="single" w:sz="4" w:color="D9D9D9"/>
-              <w:left w:val="single" w:sz="4" w:color="D9D9D9"/>
-              <w:bottom w:val="single" w:sz="4" w:color="D9D9D9"/>
-              <w:right w:val="single" w:sz="4" w:color="D9D9D9"/>
-            </w:tcBorders>
             <w:tcMar>
               <w:top w:w="90" w:type="dxa"/>
               <w:start w:w="110" w:type="dxa"/>
               <w:bottom w:w="90" w:type="dxa"/>
               <w:end w:w="110" w:type="dxa"/>
             </w:tcMar>
-            <w:shd w:fill="F8FAFC"/>
+            <w:tcBorders>
+              <w:top w:val="single" w:sz="4" w:color="D9D9D9"/>
+              <w:left w:val="single" w:sz="4" w:color="D9D9D9"/>
+              <w:bottom w:val="single" w:sz="4" w:color="D9D9D9"/>
+              <w:right w:val="single" w:sz="4" w:color="D9D9D9"/>
+              <w:insideH w:val="single" w:sz="4" w:color="D9D9D9"/>
+              <w:insideV w:val="single" w:sz="4" w:color="D9D9D9"/>
+            </w:tcBorders>
+            <w:shd w:fill="F2F6FA"/>
           </w:tcPr>
           <w:p>
             <w:pPr>
-              <w:spacing w:after="0" w:line="259" w:lineRule="auto"/>
+              <w:spacing w:after="0" w:line="252" w:lineRule="auto"/>
             </w:pPr>
             <w:r>
               <w:rPr>
-                <w:b w:val="0"/>
-                <w:i w:val="0"/>
-                <w:sz w:val="17"/>
+                <w:rFonts w:ascii="Georgia" w:hAnsi="Georgia" w:eastAsia="Georgia"/>
+                <w:sz w:val="18"/>
               </w:rPr>
               <w:t>Policy and approval</w:t>
             </w:r>
@@ -738,65 +1399,67 @@
         </w:tc>
         <w:tc>
           <w:tcPr>
-            <w:tcW w:type="dxa" w:w="3456"/>
+            <w:tcW w:type="dxa" w:w="3672"/>
             <w:vAlign w:val="center"/>
-            <w:tcBorders>
-              <w:top w:val="single" w:sz="4" w:color="D9D9D9"/>
-              <w:left w:val="single" w:sz="4" w:color="D9D9D9"/>
-              <w:bottom w:val="single" w:sz="4" w:color="D9D9D9"/>
-              <w:right w:val="single" w:sz="4" w:color="D9D9D9"/>
-            </w:tcBorders>
             <w:tcMar>
               <w:top w:w="90" w:type="dxa"/>
               <w:start w:w="110" w:type="dxa"/>
               <w:bottom w:w="90" w:type="dxa"/>
               <w:end w:w="110" w:type="dxa"/>
             </w:tcMar>
-            <w:shd w:fill="F8FAFC"/>
+            <w:tcBorders>
+              <w:top w:val="single" w:sz="4" w:color="D9D9D9"/>
+              <w:left w:val="single" w:sz="4" w:color="D9D9D9"/>
+              <w:bottom w:val="single" w:sz="4" w:color="D9D9D9"/>
+              <w:right w:val="single" w:sz="4" w:color="D9D9D9"/>
+              <w:insideH w:val="single" w:sz="4" w:color="D9D9D9"/>
+              <w:insideV w:val="single" w:sz="4" w:color="D9D9D9"/>
+            </w:tcBorders>
+            <w:shd w:fill="F2F6FA"/>
           </w:tcPr>
           <w:p>
             <w:pPr>
-              <w:spacing w:after="0" w:line="259" w:lineRule="auto"/>
+              <w:spacing w:after="0" w:line="252" w:lineRule="auto"/>
             </w:pPr>
             <w:r>
               <w:rPr>
-                <w:b w:val="0"/>
-                <w:i w:val="0"/>
-                <w:sz w:val="17"/>
+                <w:rFonts w:ascii="Georgia" w:hAnsi="Georgia" w:eastAsia="Georgia"/>
+                <w:sz w:val="18"/>
               </w:rPr>
-              <w:t>The prototype blocks discounts above 5%; saved drafts cannot be exported until confirmed.</w:t>
+              <w:t>The prototype blocks discounts above 5%, preserves unknown delivery data, and prevents export until a saved draft is confirmed.</w:t>
             </w:r>
           </w:p>
         </w:tc>
         <w:tc>
           <w:tcPr>
-            <w:tcW w:type="dxa" w:w="4104"/>
+            <w:tcW w:type="dxa" w:w="4032"/>
             <w:vAlign w:val="center"/>
-            <w:tcBorders>
-              <w:top w:val="single" w:sz="4" w:color="D9D9D9"/>
-              <w:left w:val="single" w:sz="4" w:color="D9D9D9"/>
-              <w:bottom w:val="single" w:sz="4" w:color="D9D9D9"/>
-              <w:right w:val="single" w:sz="4" w:color="D9D9D9"/>
-            </w:tcBorders>
             <w:tcMar>
               <w:top w:w="90" w:type="dxa"/>
               <w:start w:w="110" w:type="dxa"/>
               <w:bottom w:w="90" w:type="dxa"/>
               <w:end w:w="110" w:type="dxa"/>
             </w:tcMar>
-            <w:shd w:fill="F8FAFC"/>
+            <w:tcBorders>
+              <w:top w:val="single" w:sz="4" w:color="D9D9D9"/>
+              <w:left w:val="single" w:sz="4" w:color="D9D9D9"/>
+              <w:bottom w:val="single" w:sz="4" w:color="D9D9D9"/>
+              <w:right w:val="single" w:sz="4" w:color="D9D9D9"/>
+              <w:insideH w:val="single" w:sz="4" w:color="D9D9D9"/>
+              <w:insideV w:val="single" w:sz="4" w:color="D9D9D9"/>
+            </w:tcBorders>
+            <w:shd w:fill="F2F6FA"/>
           </w:tcPr>
           <w:p>
             <w:pPr>
-              <w:spacing w:after="0" w:line="259" w:lineRule="auto"/>
+              <w:spacing w:after="0" w:line="252" w:lineRule="auto"/>
             </w:pPr>
             <w:r>
               <w:rPr>
-                <w:b w:val="0"/>
-                <w:i w:val="0"/>
-                <w:sz w:val="17"/>
+                <w:rFonts w:ascii="Georgia" w:hAnsi="Georgia" w:eastAsia="Georgia"/>
+                <w:sz w:val="18"/>
               </w:rPr>
-              <w:t>No prohibited discount or unconfirmed PDF in the pilot cases.</w:t>
+              <w:t>No prohibited discount, invented delivery promise, or unconfirmed PDF appears in the pilot cases.</w:t>
             </w:r>
           </w:p>
         </w:tc>
@@ -804,30 +1467,32 @@
       <w:tr>
         <w:tc>
           <w:tcPr>
-            <w:tcW w:type="dxa" w:w="2088"/>
+            <w:tcW w:type="dxa" w:w="1944"/>
             <w:vAlign w:val="center"/>
-            <w:tcBorders>
-              <w:top w:val="single" w:sz="4" w:color="D9D9D9"/>
-              <w:left w:val="single" w:sz="4" w:color="D9D9D9"/>
-              <w:bottom w:val="single" w:sz="4" w:color="D9D9D9"/>
-              <w:right w:val="single" w:sz="4" w:color="D9D9D9"/>
-            </w:tcBorders>
             <w:tcMar>
               <w:top w:w="90" w:type="dxa"/>
               <w:start w:w="110" w:type="dxa"/>
               <w:bottom w:w="90" w:type="dxa"/>
               <w:end w:w="110" w:type="dxa"/>
             </w:tcMar>
+            <w:tcBorders>
+              <w:top w:val="single" w:sz="4" w:color="D9D9D9"/>
+              <w:left w:val="single" w:sz="4" w:color="D9D9D9"/>
+              <w:bottom w:val="single" w:sz="4" w:color="D9D9D9"/>
+              <w:right w:val="single" w:sz="4" w:color="D9D9D9"/>
+              <w:insideH w:val="single" w:sz="4" w:color="D9D9D9"/>
+              <w:insideV w:val="single" w:sz="4" w:color="D9D9D9"/>
+            </w:tcBorders>
+            <w:shd w:fill="FFFFFF"/>
           </w:tcPr>
           <w:p>
             <w:pPr>
-              <w:spacing w:after="0" w:line="259" w:lineRule="auto"/>
+              <w:spacing w:after="0" w:line="252" w:lineRule="auto"/>
             </w:pPr>
             <w:r>
               <w:rPr>
-                <w:b w:val="0"/>
-                <w:i w:val="0"/>
-                <w:sz w:val="17"/>
+                <w:rFonts w:ascii="Georgia" w:hAnsi="Georgia" w:eastAsia="Georgia"/>
+                <w:sz w:val="18"/>
               </w:rPr>
               <w:t>Service quality</w:t>
             </w:r>
@@ -835,30 +1500,32 @@
         </w:tc>
         <w:tc>
           <w:tcPr>
-            <w:tcW w:type="dxa" w:w="3456"/>
+            <w:tcW w:type="dxa" w:w="3672"/>
             <w:vAlign w:val="center"/>
-            <w:tcBorders>
-              <w:top w:val="single" w:sz="4" w:color="D9D9D9"/>
-              <w:left w:val="single" w:sz="4" w:color="D9D9D9"/>
-              <w:bottom w:val="single" w:sz="4" w:color="D9D9D9"/>
-              <w:right w:val="single" w:sz="4" w:color="D9D9D9"/>
-            </w:tcBorders>
             <w:tcMar>
               <w:top w:w="90" w:type="dxa"/>
               <w:start w:w="110" w:type="dxa"/>
               <w:bottom w:w="90" w:type="dxa"/>
               <w:end w:w="110" w:type="dxa"/>
             </w:tcMar>
+            <w:tcBorders>
+              <w:top w:val="single" w:sz="4" w:color="D9D9D9"/>
+              <w:left w:val="single" w:sz="4" w:color="D9D9D9"/>
+              <w:bottom w:val="single" w:sz="4" w:color="D9D9D9"/>
+              <w:right w:val="single" w:sz="4" w:color="D9D9D9"/>
+              <w:insideH w:val="single" w:sz="4" w:color="D9D9D9"/>
+              <w:insideV w:val="single" w:sz="4" w:color="D9D9D9"/>
+            </w:tcBorders>
+            <w:shd w:fill="FFFFFF"/>
           </w:tcPr>
           <w:p>
             <w:pPr>
-              <w:spacing w:after="0" w:line="259" w:lineRule="auto"/>
+              <w:spacing w:after="0" w:line="252" w:lineRule="auto"/>
             </w:pPr>
             <w:r>
               <w:rPr>
-                <w:b w:val="0"/>
-                <w:i w:val="0"/>
-                <w:sz w:val="17"/>
+                <w:rFonts w:ascii="Georgia" w:hAnsi="Georgia" w:eastAsia="Georgia"/>
+                <w:sz w:val="18"/>
               </w:rPr>
               <w:t>No SME response-time or conversion baseline has been measured.</w:t>
             </w:r>
@@ -866,30 +1533,32 @@
         </w:tc>
         <w:tc>
           <w:tcPr>
-            <w:tcW w:type="dxa" w:w="4104"/>
+            <w:tcW w:type="dxa" w:w="4032"/>
             <w:vAlign w:val="center"/>
-            <w:tcBorders>
-              <w:top w:val="single" w:sz="4" w:color="D9D9D9"/>
-              <w:left w:val="single" w:sz="4" w:color="D9D9D9"/>
-              <w:bottom w:val="single" w:sz="4" w:color="D9D9D9"/>
-              <w:right w:val="single" w:sz="4" w:color="D9D9D9"/>
-            </w:tcBorders>
             <w:tcMar>
               <w:top w:w="90" w:type="dxa"/>
               <w:start w:w="110" w:type="dxa"/>
               <w:bottom w:w="90" w:type="dxa"/>
               <w:end w:w="110" w:type="dxa"/>
             </w:tcMar>
+            <w:tcBorders>
+              <w:top w:val="single" w:sz="4" w:color="D9D9D9"/>
+              <w:left w:val="single" w:sz="4" w:color="D9D9D9"/>
+              <w:bottom w:val="single" w:sz="4" w:color="D9D9D9"/>
+              <w:right w:val="single" w:sz="4" w:color="D9D9D9"/>
+              <w:insideH w:val="single" w:sz="4" w:color="D9D9D9"/>
+              <w:insideV w:val="single" w:sz="4" w:color="D9D9D9"/>
+            </w:tcBorders>
+            <w:shd w:fill="FFFFFF"/>
           </w:tcPr>
           <w:p>
             <w:pPr>
-              <w:spacing w:after="0" w:line="259" w:lineRule="auto"/>
+              <w:spacing w:after="0" w:line="252" w:lineRule="auto"/>
             </w:pPr>
             <w:r>
               <w:rPr>
-                <w:b w:val="0"/>
-                <w:i w:val="0"/>
-                <w:sz w:val="17"/>
+                <w:rFonts w:ascii="Georgia" w:hAnsi="Georgia" w:eastAsia="Georgia"/>
+                <w:sz w:val="18"/>
               </w:rPr>
               <w:t>Record time to a reviewable quote, corrections, and staff feedback before making customer-service claims.</w:t>
             </w:r>
@@ -899,16 +1568,24 @@
     </w:tbl>
     <w:p>
       <w:pPr>
-        <w:spacing w:after="20"/>
+        <w:spacing w:after="0"/>
       </w:pPr>
     </w:p>
     <w:p>
+      <w:pPr>
+        <w:widowControl/>
+      </w:pPr>
       <w:r>
         <w:rPr>
-          <w:b w:val="0"/>
-          <w:i w:val="0"/>
+          <w:rFonts w:ascii="Georgia" w:hAnsi="Georgia" w:eastAsia="Georgia"/>
+          <w:sz w:val="21"/>
         </w:rPr>
-        <w:t>If the pilot validates a time saving, the business can estimate labor value as minutes saved per quote multiplied by monthly quotation volume and loaded staff cost per minute. Those inputs are currently unknown. Faster response might affect conversion, but a separate sales baseline and a longer observation period would be needed to test that claim.</w:t>
+        <w:t>If the pilot shows a time saving, the business can estimate labour value as minutes saved per quote multiplied by monthly quotation volume and loaded staff cost per minute. Those inputs are currently unknown. Any claim about conversion would need a separate sales baseline and a longer observation period.</w:t>
+      </w:r>
+    </w:p>
+    <w:p>
+      <w:r>
+        <w:br w:type="page"/>
       </w:r>
     </w:p>
     <w:p>
@@ -917,37 +1594,59 @@
       </w:pPr>
       <w:r>
         <w:rPr>
-          <w:b w:val="0"/>
-          <w:i w:val="0"/>
+          <w:rFonts w:ascii="Arial" w:hAnsi="Arial" w:eastAsia="Arial"/>
+          <w:color w:val="000000"/>
+          <w:sz w:val="30"/>
         </w:rPr>
-        <w:t>What has been demonstrated</w:t>
+        <w:t>Evidence available now</w:t>
       </w:r>
     </w:p>
     <w:p>
+      <w:pPr>
+        <w:widowControl/>
+      </w:pPr>
       <w:r>
         <w:rPr>
-          <w:b w:val="0"/>
-          <w:i w:val="0"/>
+          <w:rFonts w:ascii="Georgia" w:hAnsi="Georgia" w:eastAsia="Georgia"/>
+          <w:sz w:val="21"/>
         </w:rPr>
-        <w:t>The current v2 data package contains 50 monitor models, 44 official Dell and Lenovo source documents, 754 source pages, 50 synthetic prices, and 400 field-level evidence records. Local data validation passed. A browser acceptance run loaded all 50 records, displayed Lenovo source evidence, saved and compared two draft versions, confirmed the second, downloaded its PDF, and checked that the displayed, stored, and exported amounts agreed. The run used the OfflineDriver; it establishes the browser and quotation lifecycle on v2, not v2 model accuracy.</w:t>
+        <w:t>The final data package contains 50 monitor models, 50 synthetic prices, and 400 field-level evidence records. Local validation reports 17 offline data and tool checks with no failures or errors. The latest browser acceptance run passed all 15 recorded steps, including broad-brief clarification, a three-product shortlist, one-unit selection, quantity restoration, saved-draft comparison, confirmation, PDF download, and agreement between page, snapshot, and PDF amounts.</w:t>
       </w:r>
     </w:p>
     <w:p>
+      <w:pPr>
+        <w:widowControl/>
+      </w:pPr>
       <w:r>
         <w:rPr>
-          <w:b w:val="0"/>
-          <w:i w:val="0"/>
+          <w:rFonts w:ascii="Georgia" w:hAnsi="Georgia" w:eastAsia="Georgia"/>
+          <w:sz w:val="21"/>
         </w:rPr>
-        <w:t>The real organizer Gateway was evaluated on the earlier 12-SKU v1 catalogue. Ten of the 20 cases in its untouched sealed first pass had at least one failed check. After documented fixes, a separate run passed all 20 cases with no fallback. That repaired result shows the approach can work with the Gateway on v1. A fresh evaluation is required before reporting a model score for the 50-SKU v2 catalogue.</w:t>
+        <w:t>The application test suites currently pass 80 backend, API, Gateway, and evaluation-gate tests plus 64 Agent tests. These automated checks establish deterministic behaviour and the browser lifecycle. They are not a measurement of employee productivity.</w:t>
       </w:r>
     </w:p>
     <w:p>
+      <w:pPr>
+        <w:widowControl/>
+      </w:pPr>
       <w:r>
         <w:rPr>
-          <w:b w:val="0"/>
-          <w:i w:val="0"/>
+          <w:rFonts w:ascii="Georgia" w:hAnsi="Georgia" w:eastAsia="Georgia"/>
+          <w:sz w:val="21"/>
         </w:rPr>
-        <w:t>The recorded five-case v1 Gateway timing has five correct Agent results and a 12.705-second median, with a range from 9.025 to 19.633 seconds. The five matching human observations have not been completed, so no comparative efficiency result exists. The current Lenovo expansion has passed machine checks and browser loading; the independent spot check by someone other than the import author remains open.</w:t>
+        <w:t>The real organizer Gateway was previously evaluated against the 12-SKU catalogue. The untouched first pass scored 10 of 20 cases. After documented fixes, a separate run passed all 20 cases with no fallback. Those reports show that the Gateway tool loop can work, but they are not a model score for the final 50-SKU catalogue. A new 50-SKU Gateway evaluation is still required.</w:t>
+      </w:r>
+    </w:p>
+    <w:p>
+      <w:pPr>
+        <w:widowControl/>
+      </w:pPr>
+      <w:r>
+        <w:rPr>
+          <w:rFonts w:ascii="Georgia" w:hAnsi="Georgia" w:eastAsia="Georgia"/>
+          <w:sz w:val="21"/>
+        </w:rPr>
+        <w:t>The Lenovo expansion has passed machine validation and browser loading. An independent spot check by someone other than the import author remains open. The proposal therefore describes the source base as official manufacturer material with automated validation, not as a completed independent human audit.</w:t>
       </w:r>
     </w:p>
     <w:p>
@@ -956,83 +1655,59 @@
       </w:pPr>
       <w:r>
         <w:rPr>
-          <w:b w:val="0"/>
-          <w:i w:val="0"/>
+          <w:rFonts w:ascii="Arial" w:hAnsi="Arial" w:eastAsia="Arial"/>
+          <w:color w:val="000000"/>
+          <w:sz w:val="30"/>
         </w:rPr>
-        <w:t>Evidence to inspect</w:t>
+        <w:t>Pilot plan and decision</w:t>
       </w:r>
     </w:p>
     <w:p>
+      <w:pPr>
+        <w:widowControl/>
+      </w:pPr>
       <w:r>
         <w:rPr>
-          <w:b w:val="0"/>
-          <w:i w:val="0"/>
+          <w:rFonts w:ascii="Georgia" w:hAnsi="Georgia" w:eastAsia="Georgia"/>
+          <w:sz w:val="21"/>
         </w:rPr>
-        <w:t xml:space="preserve">The repository contains the </w:t>
+        <w:t>During the two-week pilot, the employee will work matched manual and assisted cases. The reviewer will check corrections, source links, saved-draft comparisons, policy blocks, and confirmed PDFs. Gateway fallback will be recorded separately.</w:t>
       </w:r>
-      <w:hyperlink r:id="rId10">
-        <w:r>
-          <w:rPr>
-            <w:color w:val="205475"/>
-            <w:u w:val="single"/>
-          </w:rPr>
-          <w:t>v2 data validation report</w:t>
-        </w:r>
-      </w:hyperlink>
+    </w:p>
+    <w:p>
+      <w:pPr>
+        <w:widowControl/>
+      </w:pPr>
       <w:r>
         <w:rPr>
-          <w:b w:val="0"/>
-          <w:i w:val="0"/>
+          <w:rFonts w:ascii="Georgia" w:hAnsi="Georgia" w:eastAsia="Georgia"/>
+          <w:sz w:val="21"/>
         </w:rPr>
-        <w:t xml:space="preserve">, </w:t>
+        <w:t>The pilot can run on the existing FastAPI, SQLite, Nginx, systemd, and AWS Lightsail deployment. One maintainer should own product facts and synthetic business rules during the test. The catalogue and prices should remain frozen for the measurement period.</w:t>
       </w:r>
-      <w:hyperlink r:id="rId11">
-        <w:r>
-          <w:rPr>
-            <w:color w:val="205475"/>
-            <w:u w:val="single"/>
-          </w:rPr>
-          <w:t>v2 browser acceptance record</w:t>
-        </w:r>
-      </w:hyperlink>
+    </w:p>
+    <w:p>
+      <w:pPr>
+        <w:widowControl/>
+      </w:pPr>
       <w:r>
         <w:rPr>
-          <w:b w:val="0"/>
-          <w:i w:val="0"/>
+          <w:rFonts w:ascii="Georgia" w:hAnsi="Georgia" w:eastAsia="Georgia"/>
+          <w:sz w:val="21"/>
         </w:rPr>
-        <w:t xml:space="preserve">, </w:t>
+        <w:t>Live commercial use would require approved prices, tax handling, inventory and delivery data, authenticated roles, HTTPS, backups, monitoring, recovery procedures, and an approval policy. Manufacturer source documents also need an agreed linking or distribution approach. A shared database and CRM or ERP integration should be considered only when quotation volume and operating needs justify them.</w:t>
       </w:r>
-      <w:hyperlink r:id="rId12">
-        <w:r>
-          <w:rPr>
-            <w:color w:val="205475"/>
-            <w:u w:val="single"/>
-          </w:rPr>
-          <w:t>v1 sealed Gateway evaluation</w:t>
-        </w:r>
-      </w:hyperlink>
+    </w:p>
+    <w:p>
+      <w:pPr>
+        <w:widowControl/>
+      </w:pPr>
       <w:r>
         <w:rPr>
-          <w:b w:val="0"/>
-          <w:i w:val="0"/>
+          <w:rFonts w:ascii="Georgia" w:hAnsi="Georgia" w:eastAsia="Georgia"/>
+          <w:sz w:val="21"/>
         </w:rPr>
-        <w:t xml:space="preserve">, and </w:t>
-      </w:r>
-      <w:hyperlink r:id="rId13">
-        <w:r>
-          <w:rPr>
-            <w:color w:val="205475"/>
-            <w:u w:val="single"/>
-          </w:rPr>
-          <w:t>v1 Gateway timing report</w:t>
-        </w:r>
-      </w:hyperlink>
-      <w:r>
-        <w:rPr>
-          <w:b w:val="0"/>
-          <w:i w:val="0"/>
-        </w:rPr>
-        <w:t>. The live workbench is at http://47.131.151.253/.</w:t>
+        <w:t>After two weeks, the reviewer can decide whether to extend the trial using matched timing results, independent price checks, source-page review, and confirmation history. Five matched cases can justify a broader test, but they cannot establish a lasting productivity gain. Any failed case should be investigated before expanding use.</w:t>
       </w:r>
     </w:p>
     <w:p>
@@ -1041,49 +1716,92 @@
       </w:pPr>
       <w:r>
         <w:rPr>
-          <w:b w:val="0"/>
-          <w:i w:val="0"/>
+          <w:rFonts w:ascii="Arial" w:hAnsi="Arial" w:eastAsia="Arial"/>
+          <w:color w:val="000000"/>
+          <w:sz w:val="30"/>
         </w:rPr>
-        <w:t>Pilot plan and path to use</w:t>
+        <w:t>Evidence links</w:t>
       </w:r>
     </w:p>
     <w:p>
       <w:pPr>
-        <w:keepLines/>
+        <w:pStyle w:val="ListBullet"/>
+        <w:spacing w:after="60"/>
       </w:pPr>
-      <w:r>
-        <w:rPr>
-          <w:b w:val="0"/>
-          <w:i w:val="0"/>
-        </w:rPr>
-        <w:t>We propose a two-week pilot with one quotation employee and one reviewer. Use de-identified enquiries, freeze the catalogue and prices, complete the Lenovo spot check, and run the 50-SKU v2 Gateway evaluation. Record fallback separately. The employee would work matched manual and assisted cases; the reviewer would check corrections, source links, version history, policy blocks, and confirmed PDFs before deciding on a broader trial.</w:t>
-      </w:r>
+      <w:hyperlink r:id="rId10">
+        <w:r>
+          <w:rPr>
+            <w:color w:val="1F5F99"/>
+            <w:u w:val="single"/>
+          </w:rPr>
+          <w:t>Final catalogue validation</w:t>
+        </w:r>
+      </w:hyperlink>
     </w:p>
     <w:p>
       <w:pPr>
-        <w:keepLines/>
+        <w:pStyle w:val="ListBullet"/>
+        <w:spacing w:after="60"/>
       </w:pPr>
-      <w:r>
-        <w:rPr>
-          <w:b w:val="0"/>
-          <w:i w:val="0"/>
-        </w:rPr>
-        <w:t>The pilot can run on the existing FastAPI and SQLite application with an assigned maintainer for product facts and synthetic business rules. For live commercial use, the business would need approved prices, tax handling, inventory and delivery data, role-based access, HTTPS, backup and recovery, monitoring, and a documented approval policy. Manufacturer source documents also need an appropriate linking or distribution approach. The same typed catalogue schema and tools can accept additional models or brands, but each new source and field needs verification. A shared database and CRM or ERP integration would be considered only when volume and operating needs justify them.</w:t>
-      </w:r>
+      <w:hyperlink r:id="rId19">
+        <w:r>
+          <w:rPr>
+            <w:color w:val="1F5F99"/>
+            <w:u w:val="single"/>
+          </w:rPr>
+          <w:t>Latest browser acceptance record</w:t>
+        </w:r>
+      </w:hyperlink>
     </w:p>
     <w:p>
-      <w:r>
-        <w:rPr>
-          <w:b w:val="0"/>
-          <w:i w:val="0"/>
-        </w:rPr>
-        <w:t>After two weeks, the reviewer can decide whether to extend the trial using the matched timing results, independent price checks, source-page review, and confirmation history. Five matched cases can justify a broader test, but cannot establish a lasting productivity gain. The team would investigate any failed case before expanding use.</w:t>
-      </w:r>
+      <w:pPr>
+        <w:pStyle w:val="ListBullet"/>
+        <w:spacing w:after="60"/>
+      </w:pPr>
+      <w:hyperlink r:id="rId12">
+        <w:r>
+          <w:rPr>
+            <w:color w:val="1F5F99"/>
+            <w:u w:val="single"/>
+          </w:rPr>
+          <w:t>12-SKU sealed Gateway evaluation</w:t>
+        </w:r>
+      </w:hyperlink>
+    </w:p>
+    <w:p>
+      <w:pPr>
+        <w:pStyle w:val="ListBullet"/>
+        <w:spacing w:after="60"/>
+      </w:pPr>
+      <w:hyperlink r:id="rId13">
+        <w:r>
+          <w:rPr>
+            <w:color w:val="1F5F99"/>
+            <w:u w:val="single"/>
+          </w:rPr>
+          <w:t>Gateway timing report</w:t>
+        </w:r>
+      </w:hyperlink>
+    </w:p>
+    <w:p>
+      <w:pPr>
+        <w:pStyle w:val="ListBullet"/>
+        <w:spacing w:after="60"/>
+      </w:pPr>
+      <w:hyperlink r:id="rId16">
+        <w:r>
+          <w:rPr>
+            <w:color w:val="1F5F99"/>
+            <w:u w:val="single"/>
+          </w:rPr>
+          <w:t>Live workbench</w:t>
+        </w:r>
+      </w:hyperlink>
     </w:p>
     <w:sectPr>
       <w:footerReference w:type="default" r:id="rId14"/>
-      <w:pgSz w:w="11909" w:h="16834"/>
-      <w:pgMar w:top="994" w:right="1123" w:bottom="922" w:left="1123" w:header="720" w:footer="720" w:gutter="0"/>
+      <w:pgSz w:w="12240" w:h="15840"/>
+      <w:pgMar w:top="936" w:right="1037" w:bottom="936" w:left="1037" w:header="720" w:footer="720" w:gutter="0"/>
       <w:cols w:space="720"/>
       <w:docGrid w:linePitch="360"/>
     </w:sectPr>
@@ -1475,10 +2193,10 @@
     <w:qFormat/>
     <w:rsid w:val="00FC693F"/>
     <w:pPr>
-      <w:spacing w:after="140" w:line="276" w:lineRule="auto"/>
+      <w:spacing w:after="120" w:line="259" w:lineRule="auto"/>
     </w:pPr>
     <w:rPr>
-      <w:rFonts w:ascii="Aptos" w:hAnsi="Aptos"/>
+      <w:rFonts w:ascii="Georgia" w:hAnsi="Georgia"/>
       <w:color w:val="181C23"/>
       <w:sz w:val="21"/>
     </w:rPr>
@@ -1538,15 +2256,15 @@
     <w:pPr>
       <w:keepNext/>
       <w:keepLines/>
-      <w:spacing w:before="300" w:after="120"/>
+      <w:spacing w:before="200" w:after="140"/>
       <w:outlineLvl w:val="0"/>
     </w:pPr>
     <w:rPr>
-      <w:rFonts w:asciiTheme="majorHAnsi" w:eastAsiaTheme="majorEastAsia" w:hAnsiTheme="majorHAnsi" w:cstheme="majorBidi" w:ascii="Aptos" w:hAnsi="Aptos"/>
-      <w:b/>
+      <w:rFonts w:asciiTheme="majorHAnsi" w:eastAsiaTheme="majorEastAsia" w:hAnsiTheme="majorHAnsi" w:cstheme="majorBidi" w:ascii="Arial" w:hAnsi="Arial"/>
+      <w:b w:val="0"/>
       <w:bCs/>
       <w:color w:val="000000"/>
-      <w:sz w:val="26"/>
+      <w:sz w:val="30"/>
       <w:szCs w:val="28"/>
     </w:rPr>
   </w:style>
@@ -1825,19 +2543,16 @@
     <w:rsid w:val="00FC693F"/>
     <w:pPr>
       <w:keepNext/>
-      <w:pBdr>
-        <w:bottom w:val="single" w:sz="8" w:space="4" w:color="4F81BD" w:themeColor="accent1"/>
-      </w:pBdr>
-      <w:spacing w:after="200" w:line="240" w:lineRule="auto" w:before="0"/>
+      <w:spacing w:after="360" w:line="240" w:lineRule="auto" w:before="0"/>
       <w:contextualSpacing/>
     </w:pPr>
     <w:rPr>
-      <w:rFonts w:asciiTheme="majorHAnsi" w:eastAsiaTheme="majorEastAsia" w:hAnsiTheme="majorHAnsi" w:cstheme="majorBidi" w:ascii="Aptos Display" w:hAnsi="Aptos Display"/>
+      <w:rFonts w:asciiTheme="majorHAnsi" w:eastAsiaTheme="majorEastAsia" w:hAnsiTheme="majorHAnsi" w:cstheme="majorBidi" w:ascii="Arial" w:hAnsi="Arial"/>
       <w:b/>
       <w:color w:val="000000"/>
       <w:spacing w:val="5"/>
       <w:kern w:val="28"/>
-      <w:sz w:val="42"/>
+      <w:sz w:val="50"/>
       <w:szCs w:val="52"/>
     </w:rPr>
   </w:style>
@@ -2275,9 +2990,11 @@
       <w:spacing w:line="240" w:lineRule="auto"/>
     </w:pPr>
     <w:rPr>
-      <w:b/>
+      <w:rFonts w:ascii="Georgia" w:hAnsi="Georgia"/>
+      <w:b w:val="0"/>
       <w:bCs/>
-      <w:color w:val="4F81BD" w:themeColor="accent1"/>
+      <w:i w:val="0"/>
+      <w:color w:val="4C5B6B"/>
       <w:sz w:val="18"/>
       <w:szCs w:val="18"/>
     </w:rPr>

</xml_diff>